<commit_message>
release 0.2.2 add Forum
</commit_message>
<xml_diff>
--- a/docs/ITSM_User_Guide.docx
+++ b/docs/ITSM_User_Guide.docx
@@ -2,7 +2,7 @@
 <file path=word/document.xml><?xml version="1.0" encoding="utf-8"?>
 <w:document xmlns:w="http://schemas.openxmlformats.org/wordprocessingml/2006/main" xmlns:m="http://schemas.openxmlformats.org/officeDocument/2006/math" xmlns:r="http://schemas.openxmlformats.org/officeDocument/2006/relationships" xmlns:o="urn:schemas-microsoft-com:office:office" xmlns:v="urn:schemas-microsoft-com:vml" xmlns:w10="urn:schemas-microsoft-com:office:word" xmlns:a="http://schemas.openxmlformats.org/drawingml/2006/main" xmlns:pic="http://schemas.openxmlformats.org/drawingml/2006/picture" xmlns:wp="http://schemas.openxmlformats.org/drawingml/2006/wordprocessingDrawing">
   <w:body>
-    <w:bookmarkStart w:id="48" w:name="гайд-користувача--itsm-system"/>
+    <w:bookmarkStart w:id="51" w:name="гайд-користувача-itsm-system"/>
     <w:p>
       <w:pPr>
         <w:pStyle w:val="Heading1"/>
@@ -50,7 +50,7 @@
         </w:pict>
       </w:r>
     </w:p>
-    <w:bookmarkStart w:id="20" w:name="X1f4421a3bdc54311f1c6c0c243ecb290fd5667d"/>
+    <w:bookmarkStart w:id="20" w:name="вхід-у-систему"/>
     <w:p>
       <w:pPr>
         <w:pStyle w:val="Heading2"/>
@@ -101,7 +101,7 @@
         <w:pStyle w:val="FirstParagraph"/>
       </w:pPr>
       <w:r>
-        <w:t xml:space="preserve">Обліковий запис вам створює адміністратор системи — або він з'являється автоматично, якщо ваша організація підключила систему до</w:t>
+        <w:t xml:space="preserve">Обліковий запис вам створює адміністратор системи — або він з’являється автоматично, якщо ваша організація підключила систему до</w:t>
       </w:r>
       <w:r>
         <w:t xml:space="preserve"> </w:t>
@@ -141,17 +141,11 @@
         </w:rPr>
         <w:t xml:space="preserve">Якщо ваш обліковий запис з Active Directory:</w:t>
       </w:r>
-    </w:p>
-    <w:p>
-      <w:pPr>
-        <w:numPr>
-          <w:ilvl w:val="0"/>
-          <w:numId w:val="1002"/>
-        </w:numPr>
-        <w:pStyle w:val="Compact"/>
-      </w:pPr>
-      <w:r>
-        <w:t xml:space="preserve">в поле</w:t>
+      <w:r>
+        <w:t xml:space="preserve"> </w:t>
+      </w:r>
+      <w:r>
+        <w:t xml:space="preserve">- в поле</w:t>
       </w:r>
       <w:r>
         <w:t xml:space="preserve"> </w:t>
@@ -194,34 +188,22 @@
       <w:r>
         <w:t xml:space="preserve">;</w:t>
       </w:r>
-    </w:p>
-    <w:p>
-      <w:pPr>
-        <w:numPr>
-          <w:ilvl w:val="0"/>
-          <w:numId w:val="1002"/>
-        </w:numPr>
-        <w:pStyle w:val="Compact"/>
-      </w:pPr>
-      <w:r>
-        <w:t xml:space="preserve">пароль змінюється лише в Windows/домені (за правилами вашої організації) — після цього в системі діє вже новий, нічого оновлювати не треба;</w:t>
-      </w:r>
-    </w:p>
-    <w:p>
-      <w:pPr>
-        <w:numPr>
-          <w:ilvl w:val="0"/>
-          <w:numId w:val="1002"/>
-        </w:numPr>
-        <w:pStyle w:val="Compact"/>
-      </w:pPr>
-      <w:r>
-        <w:t xml:space="preserve">якщо вхід не вдається, хоча пароль точно правильний, — ваш обліковий запис у системі, найімовірніше, ще не створено (він з'являється після чергової синхронізації з доменом). Зверніться до адміністратора.</w:t>
-      </w:r>
-    </w:p>
-    <w:p>
-      <w:pPr>
-        <w:pStyle w:val="FirstParagraph"/>
+      <w:r>
+        <w:t xml:space="preserve"> </w:t>
+      </w:r>
+      <w:r>
+        <w:t xml:space="preserve">- пароль змінюється лише в Windows/домені (за правилами вашої організації) — після цього в системі діє вже новий, нічого оновлювати не треба;</w:t>
+      </w:r>
+      <w:r>
+        <w:t xml:space="preserve"> </w:t>
+      </w:r>
+      <w:r>
+        <w:t xml:space="preserve">- якщо вхід не вдається, хоча пароль точно правильний, — ваш обліковий запис у системі, найімовірніше, ще не створено (він з’являється після чергової синхронізації з доменом). Зверніться до адміністратора.</w:t>
+      </w:r>
+    </w:p>
+    <w:p>
+      <w:pPr>
+        <w:pStyle w:val="BodyText"/>
       </w:pPr>
       <w:r>
         <w:t xml:space="preserve">Після кількох невдалих спроб входу поспіль обліковий запис тимчасово блокується (і локальний, і з AD) — це захист від підбору пароля; зачекайте вказаний час або попросіть адміністратора зняти блокування.</w:t>
@@ -253,7 +235,7 @@
       </w:r>
     </w:p>
     <w:bookmarkEnd w:id="20"/>
-    <w:bookmarkStart w:id="21" w:name="X7effac3b89ad0af8f90363145aec7d40e187f3d"/>
+    <w:bookmarkStart w:id="21" w:name="дашборд"/>
     <w:p>
       <w:pPr>
         <w:pStyle w:val="Heading2"/>
@@ -269,15 +251,15 @@
       <w:r>
         <w:t xml:space="preserve">Головна сторінка після входу показує:</w:t>
       </w:r>
-    </w:p>
-    <w:p>
-      <w:pPr>
-        <w:numPr>
-          <w:ilvl w:val="0"/>
-          <w:numId w:val="1003"/>
-        </w:numPr>
-        <w:pStyle w:val="Compact"/>
-      </w:pPr>
+      <w:r>
+        <w:t xml:space="preserve"> </w:t>
+      </w:r>
+      <w:r>
+        <w:t xml:space="preserve">-</w:t>
+      </w:r>
+      <w:r>
+        <w:t xml:space="preserve"> </w:t>
+      </w:r>
       <w:r>
         <w:rPr>
           <w:bCs/>
@@ -288,17 +270,11 @@
       <w:r>
         <w:t xml:space="preserve">: кількість ваших активних (основних) проєктів, ваших підпроєктів, відкритих задач і відкритих тікетів — тобто тих, до яких у вас є доступ (див. пояснення нижче), а не загальну статистику по всій системі. Перші три й остання цифра — клікабельні посилання (на список проєктів, задач, тікетів відповідно); «Підпроєкти» — просто цифра, без переходу, бо єдиного списку підпроєктів немає (кожен відкривається з картки на сторінці свого основного проєкту, розділ 3);</w:t>
       </w:r>
-    </w:p>
-    <w:p>
-      <w:pPr>
-        <w:numPr>
-          <w:ilvl w:val="0"/>
-          <w:numId w:val="1003"/>
-        </w:numPr>
-        <w:pStyle w:val="Compact"/>
-      </w:pPr>
-      <w:r>
-        <w:t xml:space="preserve">список</w:t>
+      <w:r>
+        <w:t xml:space="preserve"> </w:t>
+      </w:r>
+      <w:r>
+        <w:t xml:space="preserve">- список</w:t>
       </w:r>
       <w:r>
         <w:t xml:space="preserve"> </w:t>
@@ -325,7 +301,7 @@
       </w:r>
     </w:p>
     <w:bookmarkEnd w:id="21"/>
-    <w:bookmarkStart w:id="24" w:name="X5e414f13bdb863a5ec98689116b1aa50d0d2e79"/>
+    <w:bookmarkStart w:id="24" w:name="проєкти"/>
     <w:p>
       <w:pPr>
         <w:pStyle w:val="Heading2"/>
@@ -444,7 +420,7 @@
         <w:t xml:space="preserve">адміністратор системи</w:t>
       </w:r>
       <w:r>
-        <w:t xml:space="preserve">. Проєкти інших людей, до яких вас не залучено, у вашому списку не з'являться — це не помилка. Те саме стосується задач усередині таких проєктів. Якщо вам потрібен доступ до якогось проєкту — попросіть його автора, відповідального чи адміністратора додати вас учасником.</w:t>
+        <w:t xml:space="preserve">. Проєкти інших людей, до яких вас не залучено, у вашому списку не з’являться — це не помилка. Те саме стосується задач усередині таких проєктів. Якщо вам потрібен доступ до якогось проєкту — попросіть його автора, відповідального чи адміністратора додати вас учасником.</w:t>
       </w:r>
     </w:p>
     <w:p>
@@ -548,7 +524,7 @@
         <w:pStyle w:val="BodyText"/>
       </w:pPr>
       <w:r>
-        <w:t xml:space="preserve">Якщо у проєкту є підпроєкти, на картці з'явиться ще один бейдж — «📁 N підпроєктів» (рахуються лише незакриті).</w:t>
+        <w:t xml:space="preserve">Якщо у проєкту є підпроєкти, на картці з’явиться ще один бейдж — «📁 N підпроєктів» (рахуються лише незакриті).</w:t>
       </w:r>
     </w:p>
     <w:bookmarkStart w:id="22" w:name="підпроєкти"/>
@@ -581,7 +557,7 @@
         <w:t xml:space="preserve"> </w:t>
       </w:r>
       <w:r>
-        <w:t xml:space="preserve">створює новий проєкт, прив'язаний до цього як до основного — зі своєю видимістю, відповідальним і власними задачами, повністю окремими від задач основного проєкту.</w:t>
+        <w:t xml:space="preserve">створює новий проєкт, прив’язаний до цього як до основного — зі своєю видимістю, відповідальним і власними задачами, повністю окремими від задач основного проєкту.</w:t>
       </w:r>
     </w:p>
     <w:p>
@@ -633,7 +609,7 @@
         <w:t xml:space="preserve"> </w:t>
       </w:r>
       <w:r>
-        <w:t xml:space="preserve">якщо вам надали доступ до підпроєкту, а до його основного проєкту — ні, такий підпроєкт з'явиться у вашому списку</w:t>
+        <w:t xml:space="preserve">якщо вам надали доступ до підпроєкту, а до його основного проєкту — ні, такий підпроєкт з’явиться у вашому списку</w:t>
       </w:r>
       <w:r>
         <w:t xml:space="preserve"> </w:t>
@@ -724,7 +700,7 @@
         <w:t xml:space="preserve">«🔑 Доступ до проєкту»</w:t>
       </w:r>
       <w:r>
-        <w:t xml:space="preserve">: у ньому видно, хто має доступ (ім'я, email, коли й ким надано).</w:t>
+        <w:t xml:space="preserve">: у ньому видно, хто має доступ (ім’я, email, коли й ким надано).</w:t>
       </w:r>
     </w:p>
     <w:p>
@@ -742,7 +718,7 @@
         <w:t xml:space="preserve"> </w:t>
       </w:r>
       <w:r>
-        <w:t xml:space="preserve">проєкт з'явиться у вашому списку, ви побачите всі його задачі (також у загальному списку задач, календарі, на канбан-дошці й діаграмі Ганта проєкту) і зможете працювати з ними так само, як автор чи відповідальний: створювати задачі, коментувати, змінювати статус, вести облік часу, додавати файли. Про доступ вам може прийти лист «Вам надано доступ до проєкту «…»» — якщо адміністратор увімкнув сповіщення про проєкти. Не можна лише керувати складом учасників, змінювати відповідального чи статус проєкту.</w:t>
+        <w:t xml:space="preserve">проєкт з’явиться у вашому списку, ви побачите всі його задачі (також у загальному списку задач, календарі, на канбан-дошці й діаграмі Ганта проєкту) і зможете працювати з ними так само, як автор чи відповідальний: створювати задачі, коментувати, змінювати статус, вести облік часу, додавати файли. Про доступ вам може прийти лист «Вам надано доступ до проєкту «…»» — якщо адміністратор увімкнув сповіщення про проєкти. Не можна лише керувати складом учасників, змінювати відповідального чи статус проєкту.</w:t>
       </w:r>
     </w:p>
     <w:p>
@@ -762,29 +738,17 @@
       <w:r>
         <w:t xml:space="preserve">(навіть якщо ви оператор, а не керівник) — ви можете давати й забирати доступ самі:</w:t>
       </w:r>
-    </w:p>
-    <w:p>
-      <w:pPr>
-        <w:numPr>
-          <w:ilvl w:val="0"/>
-          <w:numId w:val="1004"/>
-        </w:numPr>
-        <w:pStyle w:val="Compact"/>
-      </w:pPr>
-      <w:r>
-        <w:t xml:space="preserve">Відкрийте проєкт і знайдіть блок «Доступ до проєкту».</w:t>
-      </w:r>
-    </w:p>
-    <w:p>
-      <w:pPr>
-        <w:numPr>
-          <w:ilvl w:val="0"/>
-          <w:numId w:val="1004"/>
-        </w:numPr>
-        <w:pStyle w:val="Compact"/>
-      </w:pPr>
-      <w:r>
-        <w:t xml:space="preserve">У полі</w:t>
+      <w:r>
+        <w:t xml:space="preserve"> </w:t>
+      </w:r>
+      <w:r>
+        <w:t xml:space="preserve">1. Відкрийте проєкт і знайдіть блок «Доступ до проєкту».</w:t>
+      </w:r>
+      <w:r>
+        <w:t xml:space="preserve"> </w:t>
+      </w:r>
+      <w:r>
+        <w:t xml:space="preserve">2. У полі</w:t>
       </w:r>
       <w:r>
         <w:t xml:space="preserve"> </w:t>
@@ -800,19 +764,13 @@
         <w:t xml:space="preserve"> </w:t>
       </w:r>
       <w:r>
-        <w:t xml:space="preserve">клацніть і почніть набирати ім'я — список звузиться; оберіть людину.</w:t>
-      </w:r>
-    </w:p>
-    <w:p>
-      <w:pPr>
-        <w:numPr>
-          <w:ilvl w:val="0"/>
-          <w:numId w:val="1004"/>
-        </w:numPr>
-        <w:pStyle w:val="Compact"/>
-      </w:pPr>
-      <w:r>
-        <w:t xml:space="preserve">Натисніть</w:t>
+        <w:t xml:space="preserve">клацніть і почніть набирати ім’я — список звузиться; оберіть людину.</w:t>
+      </w:r>
+      <w:r>
+        <w:t xml:space="preserve"> </w:t>
+      </w:r>
+      <w:r>
+        <w:t xml:space="preserve">3. Натисніть</w:t>
       </w:r>
       <w:r>
         <w:t xml:space="preserve"> </w:t>
@@ -846,7 +804,7 @@
     </w:p>
     <w:p>
       <w:pPr>
-        <w:pStyle w:val="FirstParagraph"/>
+        <w:pStyle w:val="BodyText"/>
       </w:pPr>
       <w:r>
         <w:t xml:space="preserve">Добре знати: автору й відповідальному доступ дається завжди, додавати їх не потрібно; додати можна лише активного користувача;</w:t>
@@ -877,7 +835,7 @@
     </w:p>
     <w:bookmarkEnd w:id="23"/>
     <w:bookmarkEnd w:id="24"/>
-    <w:bookmarkStart w:id="34" w:name="X38a42148eb78af68e5051bfff55ed0ae1ab82ba"/>
+    <w:bookmarkStart w:id="34" w:name="задачі"/>
     <w:p>
       <w:pPr>
         <w:pStyle w:val="Heading2"/>
@@ -886,7 +844,7 @@
         <w:t xml:space="preserve">4. Задачі</w:t>
       </w:r>
     </w:p>
-    <w:bookmarkStart w:id="25" w:name="X7bf45d73e884932a08060ca5fe10fc14f051c8a"/>
+    <w:bookmarkStart w:id="25" w:name="створення-задачі"/>
     <w:p>
       <w:pPr>
         <w:pStyle w:val="Heading3"/>
@@ -915,15 +873,15 @@
       <w:r>
         <w:t xml:space="preserve">:</w:t>
       </w:r>
-    </w:p>
-    <w:p>
-      <w:pPr>
-        <w:numPr>
-          <w:ilvl w:val="0"/>
-          <w:numId w:val="1005"/>
-        </w:numPr>
-        <w:pStyle w:val="Compact"/>
-      </w:pPr>
+      <w:r>
+        <w:t xml:space="preserve"> </w:t>
+      </w:r>
+      <w:r>
+        <w:t xml:space="preserve">-</w:t>
+      </w:r>
+      <w:r>
+        <w:t xml:space="preserve"> </w:t>
+      </w:r>
       <w:r>
         <w:rPr>
           <w:bCs/>
@@ -951,17 +909,17 @@
         <w:t xml:space="preserve"> </w:t>
       </w:r>
       <w:r>
-        <w:t xml:space="preserve">— обов'язково опишіть суть.</w:t>
-      </w:r>
-    </w:p>
-    <w:p>
-      <w:pPr>
-        <w:numPr>
-          <w:ilvl w:val="0"/>
-          <w:numId w:val="1005"/>
-        </w:numPr>
-        <w:pStyle w:val="Compact"/>
-      </w:pPr>
+        <w:t xml:space="preserve">— обов’язково опишіть суть.</w:t>
+      </w:r>
+      <w:r>
+        <w:t xml:space="preserve"> </w:t>
+      </w:r>
+      <w:r>
+        <w:t xml:space="preserve">-</w:t>
+      </w:r>
+      <w:r>
+        <w:t xml:space="preserve"> </w:t>
+      </w:r>
       <w:r>
         <w:rPr>
           <w:bCs/>
@@ -972,15 +930,15 @@
       <w:r>
         <w:t xml:space="preserve">: інцидент, запит на обслуговування, проблема або планове завдання.</w:t>
       </w:r>
-    </w:p>
-    <w:p>
-      <w:pPr>
-        <w:numPr>
-          <w:ilvl w:val="0"/>
-          <w:numId w:val="1005"/>
-        </w:numPr>
-        <w:pStyle w:val="Compact"/>
-      </w:pPr>
+      <w:r>
+        <w:t xml:space="preserve"> </w:t>
+      </w:r>
+      <w:r>
+        <w:t xml:space="preserve">-</w:t>
+      </w:r>
+      <w:r>
+        <w:t xml:space="preserve"> </w:t>
+      </w:r>
       <w:r>
         <w:rPr>
           <w:bCs/>
@@ -991,15 +949,15 @@
       <w:r>
         <w:t xml:space="preserve">: низький / звичайний / високий / критичний.</w:t>
       </w:r>
-    </w:p>
-    <w:p>
-      <w:pPr>
-        <w:numPr>
-          <w:ilvl w:val="0"/>
-          <w:numId w:val="1005"/>
-        </w:numPr>
-        <w:pStyle w:val="Compact"/>
-      </w:pPr>
+      <w:r>
+        <w:t xml:space="preserve"> </w:t>
+      </w:r>
+      <w:r>
+        <w:t xml:space="preserve">-</w:t>
+      </w:r>
+      <w:r>
+        <w:t xml:space="preserve"> </w:t>
+      </w:r>
       <w:r>
         <w:rPr>
           <w:bCs/>
@@ -1027,17 +985,17 @@
         <w:t xml:space="preserve"> </w:t>
       </w:r>
       <w:r>
-        <w:t xml:space="preserve">— за потреби (обидва поля необов'язкові, але потрібні, якщо плануєте бачити задачу на діаграмі Ганта чи в календарі з конкретними датами).</w:t>
-      </w:r>
-    </w:p>
-    <w:p>
-      <w:pPr>
-        <w:numPr>
-          <w:ilvl w:val="0"/>
-          <w:numId w:val="1005"/>
-        </w:numPr>
-        <w:pStyle w:val="Compact"/>
-      </w:pPr>
+        <w:t xml:space="preserve">— за потреби (обидва поля необов’язкові, але потрібні, якщо плануєте бачити задачу на діаграмі Ганта чи в календарі з конкретними датами).</w:t>
+      </w:r>
+      <w:r>
+        <w:t xml:space="preserve"> </w:t>
+      </w:r>
+      <w:r>
+        <w:t xml:space="preserve">-</w:t>
+      </w:r>
+      <w:r>
+        <w:t xml:space="preserve"> </w:t>
+      </w:r>
       <w:r>
         <w:rPr>
           <w:bCs/>
@@ -1062,7 +1020,7 @@
         <w:t xml:space="preserve">пошуком</w:t>
       </w:r>
       <w:r>
-        <w:t xml:space="preserve">: клацніть у нього й почніть набирати ім'я — список одразу звузиться до тих, хто підходить (регістр не важливий, можна кілька слів у будь-якому порядку; збіги підсвічуються).</w:t>
+        <w:t xml:space="preserve">: клацніть у нього й почніть набирати ім’я — список одразу звузиться до тих, хто підходить (регістр не важливий, можна кілька слів у будь-якому порядку; збіги підсвічуються).</w:t>
       </w:r>
       <w:r>
         <w:t xml:space="preserve"> </w:t>
@@ -1096,15 +1054,15 @@
       <w:r>
         <w:t xml:space="preserve">скасовує.</w:t>
       </w:r>
-    </w:p>
-    <w:p>
-      <w:pPr>
-        <w:numPr>
-          <w:ilvl w:val="0"/>
-          <w:numId w:val="1005"/>
-        </w:numPr>
-        <w:pStyle w:val="Compact"/>
-      </w:pPr>
+      <w:r>
+        <w:t xml:space="preserve"> </w:t>
+      </w:r>
+      <w:r>
+        <w:t xml:space="preserve">-</w:t>
+      </w:r>
+      <w:r>
+        <w:t xml:space="preserve"> </w:t>
+      </w:r>
       <w:r>
         <w:rPr>
           <w:bCs/>
@@ -1116,7 +1074,38 @@
         <w:t xml:space="preserve"> </w:t>
       </w:r>
       <w:r>
-        <w:t xml:space="preserve">— прив'яжіть задачу до одного з етапів дорожньої карти проєкту (якщо вони вже створені), або залиште «— не прив'язано —».</w:t>
+        <w:t xml:space="preserve">— прив’яжіть задачу до одного з етапів дорожньої карти проєкту (якщо вони вже створені), або залиште «— не прив’язано —».</w:t>
+      </w:r>
+    </w:p>
+    <w:p>
+      <w:pPr>
+        <w:pStyle w:val="BodyText"/>
+      </w:pPr>
+      <w:r>
+        <w:t xml:space="preserve">Новостворена задача автоматично отримує статус</w:t>
+      </w:r>
+      <w:r>
+        <w:t xml:space="preserve"> </w:t>
+      </w:r>
+      <w:r>
+        <w:rPr>
+          <w:bCs/>
+          <w:b/>
+        </w:rPr>
+        <w:t xml:space="preserve">«Нова»</w:t>
+      </w:r>
+      <w:r>
+        <w:t xml:space="preserve">, а автором записуєтесь ви. Якщо адміністратор увімкнув email-сповіщення, і ви одразу обрали виконавця (не себе), цій людині прийде лист про призначення; те саме — якщо виконавця призначать пізніше на сторінці задачі. Ближче до терміну виконання, якщо він вказаний, виконавець отримає нагадування листом (за 2 дні, за 1 день і в день настання терміну).</w:t>
+      </w:r>
+    </w:p>
+    <w:bookmarkEnd w:id="25"/>
+    <w:bookmarkStart w:id="26" w:name="перегляд-і-редагування-задачі"/>
+    <w:p>
+      <w:pPr>
+        <w:pStyle w:val="Heading3"/>
+      </w:pPr>
+      <w:r>
+        <w:t xml:space="preserve">4.2 Перегляд і редагування задачі</w:t>
       </w:r>
     </w:p>
     <w:p>
@@ -1124,30 +1113,238 @@
         <w:pStyle w:val="FirstParagraph"/>
       </w:pPr>
       <w:r>
-        <w:t xml:space="preserve">Новостворена задача автоматично отримує статус</w:t>
-      </w:r>
-      <w:r>
-        <w:t xml:space="preserve"> </w:t>
-      </w:r>
-      <w:r>
-        <w:rPr>
-          <w:bCs/>
-          <w:b/>
-        </w:rPr>
-        <w:t xml:space="preserve">«Нова»</w:t>
-      </w:r>
-      <w:r>
-        <w:t xml:space="preserve">, а автором записуєтесь ви. Якщо адміністратор увімкнув email-сповіщення, і ви одразу обрали виконавця (не себе), цій людині прийде лист про призначення; те саме — якщо виконавця призначать пізніше на сторінці задачі. Ближче до терміну виконання, якщо він вказаний, виконавець отримає нагадування листом (за 2 дні, за 1 день і в день настання терміну).</w:t>
-      </w:r>
-    </w:p>
-    <w:bookmarkEnd w:id="25"/>
-    <w:bookmarkStart w:id="26" w:name="X488be37565f24d290444a9718c5795909bd3427"/>
+        <w:t xml:space="preserve">На сторінці задачі відображаються всі деталі: тип, пріоритет, автор, термін, витрачені години.</w:t>
+      </w:r>
+    </w:p>
+    <w:p>
+      <w:pPr>
+        <w:numPr>
+          <w:ilvl w:val="0"/>
+          <w:numId w:val="1002"/>
+        </w:numPr>
+        <w:pStyle w:val="Compact"/>
+      </w:pPr>
+      <w:r>
+        <w:rPr>
+          <w:bCs/>
+          <w:b/>
+        </w:rPr>
+        <w:t xml:space="preserve">Опис</w:t>
+      </w:r>
+      <w:r>
+        <w:t xml:space="preserve"> </w:t>
+      </w:r>
+      <w:r>
+        <w:t xml:space="preserve">редагується прямо на сторінці — змініть текст у полі й натисніть</w:t>
+      </w:r>
+      <w:r>
+        <w:t xml:space="preserve"> </w:t>
+      </w:r>
+      <w:r>
+        <w:rPr>
+          <w:bCs/>
+          <w:b/>
+        </w:rPr>
+        <w:t xml:space="preserve">«Зберегти опис»</w:t>
+      </w:r>
+      <w:r>
+        <w:t xml:space="preserve">.</w:t>
+      </w:r>
+    </w:p>
+    <w:p>
+      <w:pPr>
+        <w:numPr>
+          <w:ilvl w:val="0"/>
+          <w:numId w:val="1002"/>
+        </w:numPr>
+        <w:pStyle w:val="Compact"/>
+      </w:pPr>
+      <w:r>
+        <w:t xml:space="preserve">Щоб призначити або змінити виконавця — клацніть у полі</w:t>
+      </w:r>
+      <w:r>
+        <w:t xml:space="preserve"> </w:t>
+      </w:r>
+      <w:r>
+        <w:rPr>
+          <w:bCs/>
+          <w:b/>
+        </w:rPr>
+        <w:t xml:space="preserve">«Виконавець»</w:t>
+      </w:r>
+      <w:r>
+        <w:t xml:space="preserve">, оберіть потрібну людину зі списку (або почніть набирати ім’я, щоб знайти її швидко) і натисніть</w:t>
+      </w:r>
+      <w:r>
+        <w:t xml:space="preserve"> </w:t>
+      </w:r>
+      <w:r>
+        <w:rPr>
+          <w:bCs/>
+          <w:b/>
+        </w:rPr>
+        <w:t xml:space="preserve">«Призначити»</w:t>
+      </w:r>
+      <w:r>
+        <w:t xml:space="preserve">. Це може зробити будь-який залогінений користувач (не лише керівник) — команда сама розподіляє задачі між собою.</w:t>
+      </w:r>
+    </w:p>
+    <w:p>
+      <w:pPr>
+        <w:numPr>
+          <w:ilvl w:val="0"/>
+          <w:numId w:val="1002"/>
+        </w:numPr>
+        <w:pStyle w:val="Compact"/>
+      </w:pPr>
+      <w:r>
+        <w:t xml:space="preserve">Щоб змінити статус (наприклад, узяти задачу в роботу) — оберіть новий статус у випадаючому списку і натисніть</w:t>
+      </w:r>
+      <w:r>
+        <w:t xml:space="preserve"> </w:t>
+      </w:r>
+      <w:r>
+        <w:rPr>
+          <w:bCs/>
+          <w:b/>
+        </w:rPr>
+        <w:t xml:space="preserve">«Оновити»</w:t>
+      </w:r>
+      <w:r>
+        <w:t xml:space="preserve">. Доступні статуси: Нова → В роботі → Очікує → Вирішена → Закрита.</w:t>
+      </w:r>
+    </w:p>
+    <w:p>
+      <w:pPr>
+        <w:numPr>
+          <w:ilvl w:val="0"/>
+          <w:numId w:val="1002"/>
+        </w:numPr>
+        <w:pStyle w:val="Compact"/>
+      </w:pPr>
+      <w:r>
+        <w:rPr>
+          <w:bCs/>
+          <w:b/>
+        </w:rPr>
+        <w:t xml:space="preserve">Перенесення в інший проєкт</w:t>
+      </w:r>
+      <w:r>
+        <w:t xml:space="preserve"> </w:t>
+      </w:r>
+      <w:r>
+        <w:t xml:space="preserve">— випадаючий список</w:t>
+      </w:r>
+      <w:r>
+        <w:t xml:space="preserve"> </w:t>
+      </w:r>
+      <w:r>
+        <w:rPr>
+          <w:bCs/>
+          <w:b/>
+        </w:rPr>
+        <w:t xml:space="preserve">«Проєкт»</w:t>
+      </w:r>
+      <w:r>
+        <w:t xml:space="preserve"> </w:t>
+      </w:r>
+      <w:r>
+        <w:t xml:space="preserve">показує всі проєкти, до яких у вас є доступ (основні й підпроєкти, не лише в межах поточного проєкту), натисніть</w:t>
+      </w:r>
+      <w:r>
+        <w:t xml:space="preserve"> </w:t>
+      </w:r>
+      <w:r>
+        <w:rPr>
+          <w:bCs/>
+          <w:b/>
+        </w:rPr>
+        <w:t xml:space="preserve">«Перенести»</w:t>
+      </w:r>
+      <w:r>
+        <w:t xml:space="preserve">. Якщо задача була прив’язана до етапу дорожньої карти або мала залежність з іншою задачею, що лишається в старому проєкті, — ці прив’язки автоматично знімаються (залежність можлива лише між задачами одного проєкту).</w:t>
+      </w:r>
+    </w:p>
+    <w:p>
+      <w:pPr>
+        <w:numPr>
+          <w:ilvl w:val="0"/>
+          <w:numId w:val="1002"/>
+        </w:numPr>
+        <w:pStyle w:val="Compact"/>
+      </w:pPr>
+      <w:r>
+        <w:rPr>
+          <w:bCs/>
+          <w:b/>
+        </w:rPr>
+        <w:t xml:space="preserve">Вкладення</w:t>
+      </w:r>
+      <w:r>
+        <w:t xml:space="preserve"> </w:t>
+      </w:r>
+      <w:r>
+        <w:t xml:space="preserve">— блок «Вкладення» нижче: скриншоти, фото, PDF (докладніше — розділ 4.9).</w:t>
+      </w:r>
+    </w:p>
+    <w:p>
+      <w:pPr>
+        <w:numPr>
+          <w:ilvl w:val="0"/>
+          <w:numId w:val="1002"/>
+        </w:numPr>
+        <w:pStyle w:val="Compact"/>
+      </w:pPr>
+      <w:r>
+        <w:rPr>
+          <w:bCs/>
+          <w:b/>
+        </w:rPr>
+        <w:t xml:space="preserve">Видалення задачі</w:t>
+      </w:r>
+      <w:r>
+        <w:t xml:space="preserve"> </w:t>
+      </w:r>
+      <w:r>
+        <w:t xml:space="preserve">— кнопка</w:t>
+      </w:r>
+      <w:r>
+        <w:t xml:space="preserve"> </w:t>
+      </w:r>
+      <w:r>
+        <w:rPr>
+          <w:bCs/>
+          <w:b/>
+        </w:rPr>
+        <w:t xml:space="preserve">«🗑️ Видалити задачу»</w:t>
+      </w:r>
+      <w:r>
+        <w:t xml:space="preserve"> </w:t>
+      </w:r>
+      <w:r>
+        <w:t xml:space="preserve">внизу сторінки, з підтвердженням. Дія незворотна: коментарі, записи обліку часу й зв’язки з іншими задачами видаляються разом із нею.</w:t>
+      </w:r>
+    </w:p>
+    <w:p>
+      <w:pPr>
+        <w:numPr>
+          <w:ilvl w:val="0"/>
+          <w:numId w:val="1002"/>
+        </w:numPr>
+        <w:pStyle w:val="Compact"/>
+      </w:pPr>
+      <w:r>
+        <w:t xml:space="preserve">Якщо термін виконання минув, а задача ще не закрита — вгорі сторінки з’являється червоне попередження «Прострочено термін виконання». Той самий сигнал (бейдж «⚠️») видно й на Канбан-дошці, у таблиці задач проєкту та на дашборді — зникає одразу після закриття задачі.</w:t>
+      </w:r>
+    </w:p>
+    <w:bookmarkEnd w:id="26"/>
+    <w:bookmarkStart w:id="27" w:name="коментарі"/>
     <w:p>
       <w:pPr>
         <w:pStyle w:val="Heading3"/>
       </w:pPr>
       <w:r>
-        <w:t xml:space="preserve">4.2 Перегляд і редагування задачі</w:t>
+        <w:t xml:space="preserve">4.3 Коментарі</w:t>
       </w:r>
     </w:p>
     <w:p>
@@ -1155,238 +1352,42 @@
         <w:pStyle w:val="FirstParagraph"/>
       </w:pPr>
       <w:r>
-        <w:t xml:space="preserve">На сторінці задачі відображаються всі деталі: тип, пріоритет, автор, термін, витрачені години.</w:t>
-      </w:r>
-    </w:p>
-    <w:p>
-      <w:pPr>
-        <w:numPr>
-          <w:ilvl w:val="0"/>
-          <w:numId w:val="1006"/>
-        </w:numPr>
-        <w:pStyle w:val="Compact"/>
-      </w:pPr>
-      <w:r>
-        <w:rPr>
-          <w:bCs/>
-          <w:b/>
-        </w:rPr>
-        <w:t xml:space="preserve">Опис</w:t>
-      </w:r>
-      <w:r>
-        <w:t xml:space="preserve"> </w:t>
-      </w:r>
-      <w:r>
-        <w:t xml:space="preserve">редагується прямо на сторінці — змініть текст у полі й натисніть</w:t>
-      </w:r>
-      <w:r>
-        <w:t xml:space="preserve"> </w:t>
-      </w:r>
-      <w:r>
-        <w:rPr>
-          <w:bCs/>
-          <w:b/>
-        </w:rPr>
-        <w:t xml:space="preserve">«Зберегти опис»</w:t>
-      </w:r>
-      <w:r>
-        <w:t xml:space="preserve">.</w:t>
-      </w:r>
-    </w:p>
-    <w:p>
-      <w:pPr>
-        <w:numPr>
-          <w:ilvl w:val="0"/>
-          <w:numId w:val="1006"/>
-        </w:numPr>
-        <w:pStyle w:val="Compact"/>
-      </w:pPr>
-      <w:r>
-        <w:t xml:space="preserve">Щоб призначити або змінити виконавця — клацніть у полі</w:t>
-      </w:r>
-      <w:r>
-        <w:t xml:space="preserve"> </w:t>
-      </w:r>
-      <w:r>
-        <w:rPr>
-          <w:bCs/>
-          <w:b/>
-        </w:rPr>
-        <w:t xml:space="preserve">«Виконавець»</w:t>
-      </w:r>
-      <w:r>
-        <w:t xml:space="preserve">, оберіть потрібну людину зі списку (або почніть набирати ім'я, щоб знайти її швидко) і натисніть</w:t>
-      </w:r>
-      <w:r>
-        <w:t xml:space="preserve"> </w:t>
-      </w:r>
-      <w:r>
-        <w:rPr>
-          <w:bCs/>
-          <w:b/>
-        </w:rPr>
-        <w:t xml:space="preserve">«Призначити»</w:t>
-      </w:r>
-      <w:r>
-        <w:t xml:space="preserve">. Це може зробити будь-який залогінений користувач (не лише керівник) — команда сама розподіляє задачі між собою.</w:t>
-      </w:r>
-    </w:p>
-    <w:p>
-      <w:pPr>
-        <w:numPr>
-          <w:ilvl w:val="0"/>
-          <w:numId w:val="1006"/>
-        </w:numPr>
-        <w:pStyle w:val="Compact"/>
-      </w:pPr>
-      <w:r>
-        <w:t xml:space="preserve">Щоб змінити статус (наприклад, узяти задачу в роботу) — оберіть новий статус у випадаючому списку і натисніть</w:t>
-      </w:r>
-      <w:r>
-        <w:t xml:space="preserve"> </w:t>
-      </w:r>
-      <w:r>
-        <w:rPr>
-          <w:bCs/>
-          <w:b/>
-        </w:rPr>
-        <w:t xml:space="preserve">«Оновити»</w:t>
-      </w:r>
-      <w:r>
-        <w:t xml:space="preserve">. Доступні статуси: Нова → В роботі → Очікує → Вирішена → Закрита.</w:t>
-      </w:r>
-    </w:p>
-    <w:p>
-      <w:pPr>
-        <w:numPr>
-          <w:ilvl w:val="0"/>
-          <w:numId w:val="1006"/>
-        </w:numPr>
-        <w:pStyle w:val="Compact"/>
-      </w:pPr>
-      <w:r>
-        <w:rPr>
-          <w:bCs/>
-          <w:b/>
-        </w:rPr>
-        <w:t xml:space="preserve">Перенесення в інший проєкт</w:t>
-      </w:r>
-      <w:r>
-        <w:t xml:space="preserve"> </w:t>
-      </w:r>
-      <w:r>
-        <w:t xml:space="preserve">— випадаючий список</w:t>
-      </w:r>
-      <w:r>
-        <w:t xml:space="preserve"> </w:t>
-      </w:r>
-      <w:r>
-        <w:rPr>
-          <w:bCs/>
-          <w:b/>
-        </w:rPr>
-        <w:t xml:space="preserve">«Проєкт»</w:t>
-      </w:r>
-      <w:r>
-        <w:t xml:space="preserve"> </w:t>
-      </w:r>
-      <w:r>
-        <w:t xml:space="preserve">показує всі проєкти, до яких у вас є доступ (основні й підпроєкти, не лише в межах поточного проєкту), натисніть</w:t>
-      </w:r>
-      <w:r>
-        <w:t xml:space="preserve"> </w:t>
-      </w:r>
-      <w:r>
-        <w:rPr>
-          <w:bCs/>
-          <w:b/>
-        </w:rPr>
-        <w:t xml:space="preserve">«Перенести»</w:t>
-      </w:r>
-      <w:r>
-        <w:t xml:space="preserve">. Якщо задача була прив'язана до етапу дорожньої карти або мала залежність з іншою задачею, що лишається в старому проєкті, — ці прив'язки автоматично знімаються (залежність можлива лише між задачами одного проєкту).</w:t>
-      </w:r>
-    </w:p>
-    <w:p>
-      <w:pPr>
-        <w:numPr>
-          <w:ilvl w:val="0"/>
-          <w:numId w:val="1006"/>
-        </w:numPr>
-        <w:pStyle w:val="Compact"/>
-      </w:pPr>
-      <w:r>
-        <w:rPr>
-          <w:bCs/>
-          <w:b/>
-        </w:rPr>
-        <w:t xml:space="preserve">Вкладення</w:t>
-      </w:r>
-      <w:r>
-        <w:t xml:space="preserve"> </w:t>
-      </w:r>
-      <w:r>
-        <w:t xml:space="preserve">— блок «Вкладення» нижче: скриншоти, фото, PDF (докладніше — розділ 4.9).</w:t>
-      </w:r>
-    </w:p>
-    <w:p>
-      <w:pPr>
-        <w:numPr>
-          <w:ilvl w:val="0"/>
-          <w:numId w:val="1006"/>
-        </w:numPr>
-        <w:pStyle w:val="Compact"/>
-      </w:pPr>
-      <w:r>
-        <w:rPr>
-          <w:bCs/>
-          <w:b/>
-        </w:rPr>
-        <w:t xml:space="preserve">Видалення задачі</w:t>
-      </w:r>
-      <w:r>
-        <w:t xml:space="preserve"> </w:t>
-      </w:r>
-      <w:r>
-        <w:t xml:space="preserve">— кнопка</w:t>
-      </w:r>
-      <w:r>
-        <w:t xml:space="preserve"> </w:t>
-      </w:r>
-      <w:r>
-        <w:rPr>
-          <w:bCs/>
-          <w:b/>
-        </w:rPr>
-        <w:t xml:space="preserve">«🗑️ Видалити задачу»</w:t>
-      </w:r>
-      <w:r>
-        <w:t xml:space="preserve"> </w:t>
-      </w:r>
-      <w:r>
-        <w:t xml:space="preserve">внизу сторінки, з підтвердженням. Дія незворотна: коментарі, записи обліку часу й зв'язки з іншими задачами видаляються разом із нею.</w:t>
-      </w:r>
-    </w:p>
-    <w:p>
-      <w:pPr>
-        <w:numPr>
-          <w:ilvl w:val="0"/>
-          <w:numId w:val="1006"/>
-        </w:numPr>
-        <w:pStyle w:val="Compact"/>
-      </w:pPr>
-      <w:r>
-        <w:t xml:space="preserve">Якщо термін виконання минув, а задача ще не закрита — вгорі сторінки з'являється червоне попередження «Прострочено термін виконання». Той самий сигнал (бейдж «⚠️») видно й на Канбан-дошці, у таблиці задач проєкту та на дашборді — зникає одразу після закриття задачі.</w:t>
-      </w:r>
-    </w:p>
-    <w:bookmarkEnd w:id="26"/>
-    <w:bookmarkStart w:id="27" w:name="X38ddd45aadb8e8161eac185bcf100d9bb143940"/>
+        <w:t xml:space="preserve">Внизу сторінки задачі — стрічка коментарів. Напишіть текст і натисніть</w:t>
+      </w:r>
+      <w:r>
+        <w:t xml:space="preserve"> </w:t>
+      </w:r>
+      <w:r>
+        <w:rPr>
+          <w:bCs/>
+          <w:b/>
+        </w:rPr>
+        <w:t xml:space="preserve">«Додати коментар»</w:t>
+      </w:r>
+      <w:r>
+        <w:t xml:space="preserve">. Коментарі підтримують перенос рядків, але поки без розширеного форматування (Markdown, згадування</w:t>
+      </w:r>
+      <w:r>
+        <w:t xml:space="preserve"> </w:t>
+      </w:r>
+      <w:r>
+        <w:t xml:space="preserve">@користувача</w:t>
+      </w:r>
+      <w:r>
+        <w:t xml:space="preserve"> </w:t>
+      </w:r>
+      <w:r>
+        <w:t xml:space="preserve">— заплановано на майбутні версії).</w:t>
+      </w:r>
+    </w:p>
+    <w:bookmarkEnd w:id="27"/>
+    <w:bookmarkStart w:id="28" w:name="облік-часу"/>
     <w:p>
       <w:pPr>
         <w:pStyle w:val="Heading3"/>
       </w:pPr>
       <w:r>
-        <w:t xml:space="preserve">4.3 Коментарі</w:t>
+        <w:t xml:space="preserve">4.4 Облік часу</w:t>
       </w:r>
     </w:p>
     <w:p>
@@ -1394,30 +1395,87 @@
         <w:pStyle w:val="FirstParagraph"/>
       </w:pPr>
       <w:r>
-        <w:t xml:space="preserve">Внизу сторінки задачі — стрічка коментарів. Напишіть текст і натисніть</w:t>
-      </w:r>
-      <w:r>
-        <w:t xml:space="preserve"> </w:t>
-      </w:r>
-      <w:r>
-        <w:rPr>
-          <w:bCs/>
-          <w:b/>
-        </w:rPr>
-        <w:t xml:space="preserve">«Додати коментар»</w:t>
-      </w:r>
-      <w:r>
-        <w:t xml:space="preserve">. Коментарі підтримують перенос рядків, але поки без розширеного форматування (Markdown, згадування @користувача — заплановано на майбутні версії).</w:t>
-      </w:r>
-    </w:p>
-    <w:bookmarkEnd w:id="27"/>
-    <w:bookmarkStart w:id="28" w:name="X44115ccc58c907abb9cddef1af09085a50b089f"/>
+        <w:t xml:space="preserve">У блоці</w:t>
+      </w:r>
+      <w:r>
+        <w:t xml:space="preserve"> </w:t>
+      </w:r>
+      <w:r>
+        <w:rPr>
+          <w:bCs/>
+          <w:b/>
+        </w:rPr>
+        <w:t xml:space="preserve">«Облік часу»</w:t>
+      </w:r>
+      <w:r>
+        <w:t xml:space="preserve"> </w:t>
+      </w:r>
+      <w:r>
+        <w:t xml:space="preserve">на сторінці задачі вкажіть:</w:t>
+      </w:r>
+      <w:r>
+        <w:t xml:space="preserve"> </w:t>
+      </w:r>
+      <w:r>
+        <w:t xml:space="preserve">- кількість годин (можна дробову, наприклад</w:t>
+      </w:r>
+      <w:r>
+        <w:t xml:space="preserve"> </w:t>
+      </w:r>
+      <w:r>
+        <w:rPr>
+          <w:rStyle w:val="VerbatimChar"/>
+        </w:rPr>
+        <w:t xml:space="preserve">1.5</w:t>
+      </w:r>
+      <w:r>
+        <w:t xml:space="preserve">);</w:t>
+      </w:r>
+      <w:r>
+        <w:t xml:space="preserve"> </w:t>
+      </w:r>
+      <w:r>
+        <w:t xml:space="preserve">- дату (за замовчуванням — сьогодні);</w:t>
+      </w:r>
+      <w:r>
+        <w:t xml:space="preserve"> </w:t>
+      </w:r>
+      <w:r>
+        <w:t xml:space="preserve">- категорію активності (довільний текст, наприклад «діагностика», «переговори з постачальником»).</w:t>
+      </w:r>
+    </w:p>
+    <w:p>
+      <w:pPr>
+        <w:pStyle w:val="BodyText"/>
+      </w:pPr>
+      <w:r>
+        <w:t xml:space="preserve">Натисніть</w:t>
+      </w:r>
+      <w:r>
+        <w:t xml:space="preserve"> </w:t>
+      </w:r>
+      <w:r>
+        <w:rPr>
+          <w:bCs/>
+          <w:b/>
+        </w:rPr>
+        <w:t xml:space="preserve">«Додати»</w:t>
+      </w:r>
+      <w:r>
+        <w:t xml:space="preserve"> </w:t>
+      </w:r>
+      <w:r>
+        <w:t xml:space="preserve">— час додасться до загального лічильника витрачених годин по задачі, а сам запис з’явиться в таблиці нижче форми (дата, хто додав, скільки годин, категорія). Видалити чи виправити вже доданий запис часу поки не можна через інтерфейс — у разі помилки зверніться до адміністратора.</w:t>
+      </w:r>
+    </w:p>
+    <w:bookmarkEnd w:id="28"/>
+    <w:bookmarkStart w:id="29" w:name="канбан-дошка"/>
     <w:p>
       <w:pPr>
         <w:pStyle w:val="Heading3"/>
       </w:pPr>
       <w:r>
-        <w:t xml:space="preserve">4.4 Облік часу</w:t>
+        <w:t xml:space="preserve">4.5 Канбан-дошка</w:t>
       </w:r>
     </w:p>
     <w:p>
@@ -1425,35 +1483,290 @@
         <w:pStyle w:val="FirstParagraph"/>
       </w:pPr>
       <w:r>
-        <w:t xml:space="preserve">У блоці</w:t>
-      </w:r>
-      <w:r>
-        <w:t xml:space="preserve"> </w:t>
-      </w:r>
-      <w:r>
-        <w:rPr>
-          <w:bCs/>
-          <w:b/>
-        </w:rPr>
-        <w:t xml:space="preserve">«Облік часу»</w:t>
-      </w:r>
-      <w:r>
-        <w:t xml:space="preserve"> </w:t>
-      </w:r>
-      <w:r>
-        <w:t xml:space="preserve">на сторінці задачі вкажіть:</w:t>
-      </w:r>
-    </w:p>
-    <w:p>
-      <w:pPr>
-        <w:numPr>
-          <w:ilvl w:val="0"/>
-          <w:numId w:val="1007"/>
-        </w:numPr>
-        <w:pStyle w:val="Compact"/>
-      </w:pPr>
-      <w:r>
-        <w:t xml:space="preserve">кількість годин (можна дробову, наприклад</w:t>
+        <w:t xml:space="preserve">На сторінці проєкту натисніть</w:t>
+      </w:r>
+      <w:r>
+        <w:t xml:space="preserve"> </w:t>
+      </w:r>
+      <w:r>
+        <w:rPr>
+          <w:bCs/>
+          <w:b/>
+        </w:rPr>
+        <w:t xml:space="preserve">«📋 Канбан-дошка»</w:t>
+      </w:r>
+      <w:r>
+        <w:t xml:space="preserve"> </w:t>
+      </w:r>
+      <w:r>
+        <w:t xml:space="preserve">— задачі показані колонками за статусом (Нова, В роботі, Очікує, Вирішена, Закрита). Перетягніть картку задачі мишкою в іншу колонку — статус зміниться одразу, без відкриття самої задачі. Якщо перетягування не спрацювало (наприклад, пропало з’єднання) — з’явиться повідомлення про помилку, а картка повернеться на своє місце.</w:t>
+      </w:r>
+    </w:p>
+    <w:bookmarkEnd w:id="29"/>
+    <w:bookmarkStart w:id="30" w:name="діаграма-ганта"/>
+    <w:p>
+      <w:pPr>
+        <w:pStyle w:val="Heading3"/>
+      </w:pPr>
+      <w:r>
+        <w:t xml:space="preserve">4.6 Діаграма Ганта</w:t>
+      </w:r>
+    </w:p>
+    <w:p>
+      <w:pPr>
+        <w:pStyle w:val="FirstParagraph"/>
+      </w:pPr>
+      <w:r>
+        <w:t xml:space="preserve">На сторінці проєкту натисніть</w:t>
+      </w:r>
+      <w:r>
+        <w:t xml:space="preserve"> </w:t>
+      </w:r>
+      <w:r>
+        <w:rPr>
+          <w:bCs/>
+          <w:b/>
+        </w:rPr>
+        <w:t xml:space="preserve">«📊 Діаграма Ганта»</w:t>
+      </w:r>
+      <w:r>
+        <w:t xml:space="preserve"> </w:t>
+      </w:r>
+      <w:r>
+        <w:t xml:space="preserve">— усі задачі проєкту показані смугами вздовж часової шкали. При відкритті сторінка одразу прокручується так, щоб</w:t>
+      </w:r>
+      <w:r>
+        <w:t xml:space="preserve"> </w:t>
+      </w:r>
+      <w:r>
+        <w:rPr>
+          <w:bCs/>
+          <w:b/>
+        </w:rPr>
+        <w:t xml:space="preserve">сьогоднішня дата була біля лівого краю</w:t>
+      </w:r>
+      <w:r>
+        <w:t xml:space="preserve"> </w:t>
+      </w:r>
+      <w:r>
+        <w:t xml:space="preserve">— щоб не гортати вручну в пошуках поточного моменту серед задач.</w:t>
+      </w:r>
+    </w:p>
+    <w:p>
+      <w:pPr>
+        <w:numPr>
+          <w:ilvl w:val="0"/>
+          <w:numId w:val="1003"/>
+        </w:numPr>
+        <w:pStyle w:val="Compact"/>
+      </w:pPr>
+      <w:r>
+        <w:rPr>
+          <w:bCs/>
+          <w:b/>
+        </w:rPr>
+        <w:t xml:space="preserve">Зміна термінів</w:t>
+      </w:r>
+      <w:r>
+        <w:t xml:space="preserve">: перетягніть смугу вліво/вправо, щоб змінити обидві дати одразу, або розтягніть за край, щоб змінити лише дату початку чи завершення. Зміна зберігається автоматично, без окремої кнопки «Зберегти».</w:t>
+      </w:r>
+    </w:p>
+    <w:p>
+      <w:pPr>
+        <w:numPr>
+          <w:ilvl w:val="0"/>
+          <w:numId w:val="1003"/>
+        </w:numPr>
+        <w:pStyle w:val="Compact"/>
+      </w:pPr>
+      <w:r>
+        <w:t xml:space="preserve">Задачі, для яких дати ще не вказані, показані орієнтовно (за датою створення) — щойно ви їх перетягнете, з’являться справжні дати.</w:t>
+      </w:r>
+    </w:p>
+    <w:p>
+      <w:pPr>
+        <w:numPr>
+          <w:ilvl w:val="0"/>
+          <w:numId w:val="1003"/>
+        </w:numPr>
+        <w:pStyle w:val="Compact"/>
+      </w:pPr>
+      <w:r>
+        <w:rPr>
+          <w:bCs/>
+          <w:b/>
+        </w:rPr>
+        <w:t xml:space="preserve">Колір смуги</w:t>
+      </w:r>
+      <w:r>
+        <w:t xml:space="preserve"> </w:t>
+      </w:r>
+      <w:r>
+        <w:t xml:space="preserve">відповідає пріоритету задачі (як і в календарі); закриті задачі — сірі.</w:t>
+      </w:r>
+    </w:p>
+    <w:p>
+      <w:pPr>
+        <w:numPr>
+          <w:ilvl w:val="0"/>
+          <w:numId w:val="1003"/>
+        </w:numPr>
+        <w:pStyle w:val="Compact"/>
+      </w:pPr>
+      <w:r>
+        <w:t xml:space="preserve">Натисніть на смугу, щоб відкрити саму задачу.</w:t>
+      </w:r>
+    </w:p>
+    <w:p>
+      <w:pPr>
+        <w:numPr>
+          <w:ilvl w:val="0"/>
+          <w:numId w:val="1003"/>
+        </w:numPr>
+        <w:pStyle w:val="Compact"/>
+      </w:pPr>
+      <w:r>
+        <w:rPr>
+          <w:bCs/>
+          <w:b/>
+        </w:rPr>
+        <w:t xml:space="preserve">Залежності між задачами</w:t>
+      </w:r>
+      <w:r>
+        <w:t xml:space="preserve"> </w:t>
+      </w:r>
+      <w:r>
+        <w:t xml:space="preserve">показані стрілками. Щоб додати залежність — унизу сторінки оберіть дві задачі та тип зв’язку («залежить від», «блокує», «пов’язана з», «дублює») і натисніть «Додати». У таблиці нижче кожен уже створений зв’язок можна</w:t>
+      </w:r>
+      <w:r>
+        <w:t xml:space="preserve"> </w:t>
+      </w:r>
+      <w:r>
+        <w:rPr>
+          <w:bCs/>
+          <w:b/>
+        </w:rPr>
+        <w:t xml:space="preserve">змінити</w:t>
+      </w:r>
+      <w:r>
+        <w:t xml:space="preserve"> </w:t>
+      </w:r>
+      <w:r>
+        <w:t xml:space="preserve">(виберіть інший тип у випадаючому списку — зберігається одразу) або</w:t>
+      </w:r>
+      <w:r>
+        <w:t xml:space="preserve"> </w:t>
+      </w:r>
+      <w:r>
+        <w:rPr>
+          <w:bCs/>
+          <w:b/>
+        </w:rPr>
+        <w:t xml:space="preserve">видалити</w:t>
+      </w:r>
+      <w:r>
+        <w:t xml:space="preserve"> </w:t>
+      </w:r>
+      <w:r>
+        <w:t xml:space="preserve">кнопкою «Видалити» (з підтвердженням).</w:t>
+      </w:r>
+    </w:p>
+    <w:bookmarkEnd w:id="30"/>
+    <w:bookmarkStart w:id="31" w:name="дорожня-карта"/>
+    <w:p>
+      <w:pPr>
+        <w:pStyle w:val="Heading3"/>
+      </w:pPr>
+      <w:r>
+        <w:t xml:space="preserve">4.7 Дорожня карта</w:t>
+      </w:r>
+    </w:p>
+    <w:p>
+      <w:pPr>
+        <w:pStyle w:val="FirstParagraph"/>
+      </w:pPr>
+      <w:r>
+        <w:t xml:space="preserve">На сторінці проєкту натисніть</w:t>
+      </w:r>
+      <w:r>
+        <w:t xml:space="preserve"> </w:t>
+      </w:r>
+      <w:r>
+        <w:rPr>
+          <w:bCs/>
+          <w:b/>
+        </w:rPr>
+        <w:t xml:space="preserve">«🗺️ Дорожня карта»</w:t>
+      </w:r>
+      <w:r>
+        <w:t xml:space="preserve"> </w:t>
+      </w:r>
+      <w:r>
+        <w:t xml:space="preserve">— етапи (контрольні точки) проєкту у вигляді карток, кожна з:</w:t>
+      </w:r>
+      <w:r>
+        <w:t xml:space="preserve"> </w:t>
+      </w:r>
+      <w:r>
+        <w:t xml:space="preserve">- статусом (заплановано / у процесі / завершено / затримується) — змінюється одразу у випадаючому списку;</w:t>
+      </w:r>
+      <w:r>
+        <w:t xml:space="preserve"> </w:t>
+      </w:r>
+      <w:r>
+        <w:t xml:space="preserve">- цільовою датою (якщо вказана) — якщо вона в минулому, а етап ще не завершено, поруч автоматично з’являється бейдж «⚠️ Прострочено» (незалежно від того, чи хтось вручну обрав статус «затримується»);</w:t>
+      </w:r>
+      <w:r>
+        <w:t xml:space="preserve"> </w:t>
+      </w:r>
+      <w:r>
+        <w:t xml:space="preserve">- прогрес-баром і лічильником задач («N з M задач закрито») — рахується автоматично на основі задач, прив’язаних до цього етапу;</w:t>
+      </w:r>
+      <w:r>
+        <w:t xml:space="preserve"> </w:t>
+      </w:r>
+      <w:r>
+        <w:t xml:space="preserve">- списком самих прив’язаних задач (закриті — перекреслені).</w:t>
+      </w:r>
+    </w:p>
+    <w:p>
+      <w:pPr>
+        <w:pStyle w:val="BlockText"/>
+      </w:pPr>
+      <w:r>
+        <w:t xml:space="preserve">Створювати та видаляти етапи можуть лише ролі «Адміністратор системи» та «Керівник ІТ-підрозділу». Змінювати статус уже створеного етапу може будь-хто з доступом до проєкту. Видалення етапу</w:t>
+      </w:r>
+      <w:r>
+        <w:t xml:space="preserve"> </w:t>
+      </w:r>
+      <w:r>
+        <w:rPr>
+          <w:bCs/>
+          <w:b/>
+        </w:rPr>
+        <w:t xml:space="preserve">не видаляє</w:t>
+      </w:r>
+      <w:r>
+        <w:t xml:space="preserve"> </w:t>
+      </w:r>
+      <w:r>
+        <w:t xml:space="preserve">прив’язані задачі — вони просто втрачають прив’язку до цього етапу і лишаються в проєкті.</w:t>
+      </w:r>
+    </w:p>
+    <w:p>
+      <w:pPr>
+        <w:pStyle w:val="FirstParagraph"/>
+      </w:pPr>
+      <w:r>
+        <w:t xml:space="preserve">Прив’язати задачу до етапу можна при її створенні (розділ 4.1) або пізніше на сторінці самої задачі — там же можна й зняти прив’язку, обравши «— не прив’язано —».</w:t>
+      </w:r>
+    </w:p>
+    <w:p>
+      <w:pPr>
+        <w:pStyle w:val="BodyText"/>
+      </w:pPr>
+      <w:r>
+        <w:t xml:space="preserve">Проєкт із хоча б одним простроченим етапом позначається бейджем «⚠️ Прострочено етап» на картці в списку</w:t>
       </w:r>
       <w:r>
         <w:t xml:space="preserve"> </w:t>
@@ -1462,34 +1775,23 @@
         <w:rPr>
           <w:rStyle w:val="VerbatimChar"/>
         </w:rPr>
-        <w:t xml:space="preserve">1.5</w:t>
-      </w:r>
-      <w:r>
-        <w:t xml:space="preserve">);</w:t>
-      </w:r>
-    </w:p>
-    <w:p>
-      <w:pPr>
-        <w:numPr>
-          <w:ilvl w:val="0"/>
-          <w:numId w:val="1007"/>
-        </w:numPr>
-        <w:pStyle w:val="Compact"/>
-      </w:pPr>
-      <w:r>
-        <w:t xml:space="preserve">дату (за замовчуванням — сьогодні);</w:t>
-      </w:r>
-    </w:p>
-    <w:p>
-      <w:pPr>
-        <w:numPr>
-          <w:ilvl w:val="0"/>
-          <w:numId w:val="1007"/>
-        </w:numPr>
-        <w:pStyle w:val="Compact"/>
-      </w:pPr>
-      <w:r>
-        <w:t xml:space="preserve">категорію активності (довільний текст, наприклад «діагностика», «переговори з постачальником»).</w:t>
+        <w:t xml:space="preserve">/projects</w:t>
+      </w:r>
+      <w:r>
+        <w:t xml:space="preserve"> </w:t>
+      </w:r>
+      <w:r>
+        <w:t xml:space="preserve">і на сторінці самого проєкту.</w:t>
+      </w:r>
+    </w:p>
+    <w:bookmarkEnd w:id="31"/>
+    <w:bookmarkStart w:id="32" w:name="облік-часу-по-проєкту"/>
+    <w:p>
+      <w:pPr>
+        <w:pStyle w:val="Heading3"/>
+      </w:pPr>
+      <w:r>
+        <w:t xml:space="preserve">4.8 Облік часу по проєкту</w:t>
       </w:r>
     </w:p>
     <w:p>
@@ -1497,33 +1799,129 @@
         <w:pStyle w:val="FirstParagraph"/>
       </w:pPr>
       <w:r>
-        <w:t xml:space="preserve">Натисніть</w:t>
-      </w:r>
-      <w:r>
-        <w:t xml:space="preserve"> </w:t>
-      </w:r>
-      <w:r>
-        <w:rPr>
-          <w:bCs/>
-          <w:b/>
-        </w:rPr>
-        <w:t xml:space="preserve">«Додати»</w:t>
-      </w:r>
-      <w:r>
-        <w:t xml:space="preserve"> </w:t>
-      </w:r>
-      <w:r>
-        <w:t xml:space="preserve">— час додасться до загального лічильника витрачених годин по задачі, а сам запис з'явиться в таблиці нижче форми (дата, хто додав, скільки годин, категорія). Видалити чи виправити вже доданий запис часу поки не можна через інтерфейс — у разі помилки зверніться до адміністратора.</w:t>
-      </w:r>
-    </w:p>
-    <w:bookmarkEnd w:id="28"/>
-    <w:bookmarkStart w:id="29" w:name="X4bd7fb309eb3bd4f0a7fb9aea9b124333baefc4"/>
+        <w:t xml:space="preserve">На сторінці проєкту натисніть</w:t>
+      </w:r>
+      <w:r>
+        <w:t xml:space="preserve"> </w:t>
+      </w:r>
+      <w:r>
+        <w:rPr>
+          <w:bCs/>
+          <w:b/>
+        </w:rPr>
+        <w:t xml:space="preserve">«⏱️ Облік часу»</w:t>
+      </w:r>
+      <w:r>
+        <w:t xml:space="preserve"> </w:t>
+      </w:r>
+      <w:r>
+        <w:t xml:space="preserve">— зведена сторінка з чотирьох частин:</w:t>
+      </w:r>
+      <w:r>
+        <w:t xml:space="preserve"> </w:t>
+      </w:r>
+      <w:r>
+        <w:t xml:space="preserve">1.</w:t>
+      </w:r>
+      <w:r>
+        <w:t xml:space="preserve"> </w:t>
+      </w:r>
+      <w:r>
+        <w:rPr>
+          <w:bCs/>
+          <w:b/>
+        </w:rPr>
+        <w:t xml:space="preserve">Загальна сума годин</w:t>
+      </w:r>
+      <w:r>
+        <w:t xml:space="preserve"> </w:t>
+      </w:r>
+      <w:r>
+        <w:t xml:space="preserve">по всьому проєкту одразу.</w:t>
+      </w:r>
+      <w:r>
+        <w:t xml:space="preserve"> </w:t>
+      </w:r>
+      <w:r>
+        <w:t xml:space="preserve">2.</w:t>
+      </w:r>
+      <w:r>
+        <w:t xml:space="preserve"> </w:t>
+      </w:r>
+      <w:r>
+        <w:rPr>
+          <w:bCs/>
+          <w:b/>
+        </w:rPr>
+        <w:t xml:space="preserve">Розбивка за період</w:t>
+      </w:r>
+      <w:r>
+        <w:t xml:space="preserve"> </w:t>
+      </w:r>
+      <w:r>
+        <w:t xml:space="preserve">— три вкладки: «По днях», «По тижнях» (тиждень рахується за ISO 8601, з понеділка), «По місяцях». У кожній — дві таблиці поруч: скільки годин витрачено в кожен конкретний день/тиждень/місяць загалом, і скільки — з розбивкою по кожному учаснику окремо (та сама сума, тільки по особах).</w:t>
+      </w:r>
+      <w:r>
+        <w:t xml:space="preserve"> </w:t>
+      </w:r>
+      <w:r>
+        <w:t xml:space="preserve">3.</w:t>
+      </w:r>
+      <w:r>
+        <w:t xml:space="preserve"> </w:t>
+      </w:r>
+      <w:r>
+        <w:rPr>
+          <w:bCs/>
+          <w:b/>
+        </w:rPr>
+        <w:t xml:space="preserve">Розбивка по учасниках</w:t>
+      </w:r>
+      <w:r>
+        <w:t xml:space="preserve"> </w:t>
+      </w:r>
+      <w:r>
+        <w:t xml:space="preserve">— хто скільки годин витратив, від найбільшого до найменшого.</w:t>
+      </w:r>
+      <w:r>
+        <w:t xml:space="preserve"> </w:t>
+      </w:r>
+      <w:r>
+        <w:t xml:space="preserve">4.</w:t>
+      </w:r>
+      <w:r>
+        <w:t xml:space="preserve"> </w:t>
+      </w:r>
+      <w:r>
+        <w:rPr>
+          <w:bCs/>
+          <w:b/>
+        </w:rPr>
+        <w:t xml:space="preserve">Повний список усіх записів</w:t>
+      </w:r>
+      <w:r>
+        <w:t xml:space="preserve"> </w:t>
+      </w:r>
+      <w:r>
+        <w:t xml:space="preserve">по всіх задачах проєкту — дата, задача (з посиланням), хто, скільки годин, категорія.</w:t>
+      </w:r>
+    </w:p>
+    <w:p>
+      <w:pPr>
+        <w:pStyle w:val="BodyText"/>
+      </w:pPr>
+      <w:r>
+        <w:t xml:space="preserve">Це те саме, що й окремі записи на сторінках задач (розділ 4.4), лише зібрані і згруповані в одному місці для проєкту в цілому.</w:t>
+      </w:r>
+    </w:p>
+    <w:bookmarkEnd w:id="32"/>
+    <w:bookmarkStart w:id="33" w:name="вкладення-до-задачі"/>
     <w:p>
       <w:pPr>
         <w:pStyle w:val="Heading3"/>
       </w:pPr>
       <w:r>
-        <w:t xml:space="preserve">4.5 Канбан-дошка</w:t>
+        <w:t xml:space="preserve">4.9 Вкладення до задачі</w:t>
       </w:r>
     </w:p>
     <w:p>
@@ -1531,476 +1929,6 @@
         <w:pStyle w:val="FirstParagraph"/>
       </w:pPr>
       <w:r>
-        <w:t xml:space="preserve">На сторінці проєкту натисніть</w:t>
-      </w:r>
-      <w:r>
-        <w:t xml:space="preserve"> </w:t>
-      </w:r>
-      <w:r>
-        <w:rPr>
-          <w:bCs/>
-          <w:b/>
-        </w:rPr>
-        <w:t xml:space="preserve">«📋 Канбан-дошка»</w:t>
-      </w:r>
-      <w:r>
-        <w:t xml:space="preserve"> </w:t>
-      </w:r>
-      <w:r>
-        <w:t xml:space="preserve">— задачі показані колонками за статусом (Нова, В роботі, Очікує, Вирішена, Закрита). Перетягніть картку задачі мишкою в іншу колонку — статус зміниться одразу, без відкриття самої задачі. Якщо перетягування не спрацювало (наприклад, пропало з'єднання) — з'явиться повідомлення про помилку, а картка повернеться на своє місце.</w:t>
-      </w:r>
-    </w:p>
-    <w:bookmarkEnd w:id="29"/>
-    <w:bookmarkStart w:id="30" w:name="X54dd1c96eab6ee2e6adfabcbc4e58dadb5a4d19"/>
-    <w:p>
-      <w:pPr>
-        <w:pStyle w:val="Heading3"/>
-      </w:pPr>
-      <w:r>
-        <w:t xml:space="preserve">4.6 Діаграма Ганта</w:t>
-      </w:r>
-    </w:p>
-    <w:p>
-      <w:pPr>
-        <w:pStyle w:val="FirstParagraph"/>
-      </w:pPr>
-      <w:r>
-        <w:t xml:space="preserve">На сторінці проєкту натисніть</w:t>
-      </w:r>
-      <w:r>
-        <w:t xml:space="preserve"> </w:t>
-      </w:r>
-      <w:r>
-        <w:rPr>
-          <w:bCs/>
-          <w:b/>
-        </w:rPr>
-        <w:t xml:space="preserve">«📊 Діаграма Ганта»</w:t>
-      </w:r>
-      <w:r>
-        <w:t xml:space="preserve"> </w:t>
-      </w:r>
-      <w:r>
-        <w:t xml:space="preserve">— усі задачі проєкту показані смугами вздовж часової шкали. При відкритті сторінка одразу прокручується так, щоб</w:t>
-      </w:r>
-      <w:r>
-        <w:t xml:space="preserve"> </w:t>
-      </w:r>
-      <w:r>
-        <w:rPr>
-          <w:bCs/>
-          <w:b/>
-        </w:rPr>
-        <w:t xml:space="preserve">сьогоднішня дата була біля лівого краю</w:t>
-      </w:r>
-      <w:r>
-        <w:t xml:space="preserve"> </w:t>
-      </w:r>
-      <w:r>
-        <w:t xml:space="preserve">— щоб не гортати вручну в пошуках поточного моменту серед задач.</w:t>
-      </w:r>
-    </w:p>
-    <w:p>
-      <w:pPr>
-        <w:numPr>
-          <w:ilvl w:val="0"/>
-          <w:numId w:val="1008"/>
-        </w:numPr>
-        <w:pStyle w:val="Compact"/>
-      </w:pPr>
-      <w:r>
-        <w:rPr>
-          <w:bCs/>
-          <w:b/>
-        </w:rPr>
-        <w:t xml:space="preserve">Зміна термінів</w:t>
-      </w:r>
-      <w:r>
-        <w:t xml:space="preserve">: перетягніть смугу вліво/вправо, щоб змінити обидві дати одразу, або розтягніть за край, щоб змінити лише дату початку чи завершення. Зміна зберігається автоматично, без окремої кнопки «Зберегти».</w:t>
-      </w:r>
-    </w:p>
-    <w:p>
-      <w:pPr>
-        <w:numPr>
-          <w:ilvl w:val="0"/>
-          <w:numId w:val="1008"/>
-        </w:numPr>
-        <w:pStyle w:val="Compact"/>
-      </w:pPr>
-      <w:r>
-        <w:t xml:space="preserve">Задачі, для яких дати ще не вказані, показані орієнтовно (за датою створення) — щойно ви їх перетягнете, з'являться справжні дати.</w:t>
-      </w:r>
-    </w:p>
-    <w:p>
-      <w:pPr>
-        <w:numPr>
-          <w:ilvl w:val="0"/>
-          <w:numId w:val="1008"/>
-        </w:numPr>
-        <w:pStyle w:val="Compact"/>
-      </w:pPr>
-      <w:r>
-        <w:rPr>
-          <w:bCs/>
-          <w:b/>
-        </w:rPr>
-        <w:t xml:space="preserve">Колір смуги</w:t>
-      </w:r>
-      <w:r>
-        <w:t xml:space="preserve"> </w:t>
-      </w:r>
-      <w:r>
-        <w:t xml:space="preserve">відповідає пріоритету задачі (як і в календарі); закриті задачі — сірі.</w:t>
-      </w:r>
-    </w:p>
-    <w:p>
-      <w:pPr>
-        <w:numPr>
-          <w:ilvl w:val="0"/>
-          <w:numId w:val="1008"/>
-        </w:numPr>
-        <w:pStyle w:val="Compact"/>
-      </w:pPr>
-      <w:r>
-        <w:t xml:space="preserve">Натисніть на смугу, щоб відкрити саму задачу.</w:t>
-      </w:r>
-    </w:p>
-    <w:p>
-      <w:pPr>
-        <w:numPr>
-          <w:ilvl w:val="0"/>
-          <w:numId w:val="1008"/>
-        </w:numPr>
-        <w:pStyle w:val="Compact"/>
-      </w:pPr>
-      <w:r>
-        <w:rPr>
-          <w:bCs/>
-          <w:b/>
-        </w:rPr>
-        <w:t xml:space="preserve">Залежності між задачами</w:t>
-      </w:r>
-      <w:r>
-        <w:t xml:space="preserve"> </w:t>
-      </w:r>
-      <w:r>
-        <w:t xml:space="preserve">показані стрілками. Щоб додати залежність — унизу сторінки оберіть дві задачі та тип зв'язку («залежить від», «блокує», «пов'язана з», «дублює») і натисніть «Додати». У таблиці нижче кожен уже створений зв'язок можна</w:t>
-      </w:r>
-      <w:r>
-        <w:t xml:space="preserve"> </w:t>
-      </w:r>
-      <w:r>
-        <w:rPr>
-          <w:bCs/>
-          <w:b/>
-        </w:rPr>
-        <w:t xml:space="preserve">змінити</w:t>
-      </w:r>
-      <w:r>
-        <w:t xml:space="preserve"> </w:t>
-      </w:r>
-      <w:r>
-        <w:t xml:space="preserve">(виберіть інший тип у випадаючому списку — зберігається одразу) або</w:t>
-      </w:r>
-      <w:r>
-        <w:t xml:space="preserve"> </w:t>
-      </w:r>
-      <w:r>
-        <w:rPr>
-          <w:bCs/>
-          <w:b/>
-        </w:rPr>
-        <w:t xml:space="preserve">видалити</w:t>
-      </w:r>
-      <w:r>
-        <w:t xml:space="preserve"> </w:t>
-      </w:r>
-      <w:r>
-        <w:t xml:space="preserve">кнопкою «Видалити» (з підтвердженням).</w:t>
-      </w:r>
-    </w:p>
-    <w:bookmarkEnd w:id="30"/>
-    <w:bookmarkStart w:id="31" w:name="Xdfc1115e4e16263a9fcd8213a76d83cfdfbadeb"/>
-    <w:p>
-      <w:pPr>
-        <w:pStyle w:val="Heading3"/>
-      </w:pPr>
-      <w:r>
-        <w:t xml:space="preserve">4.7 Дорожня карта</w:t>
-      </w:r>
-    </w:p>
-    <w:p>
-      <w:pPr>
-        <w:pStyle w:val="FirstParagraph"/>
-      </w:pPr>
-      <w:r>
-        <w:t xml:space="preserve">На сторінці проєкту натисніть</w:t>
-      </w:r>
-      <w:r>
-        <w:t xml:space="preserve"> </w:t>
-      </w:r>
-      <w:r>
-        <w:rPr>
-          <w:bCs/>
-          <w:b/>
-        </w:rPr>
-        <w:t xml:space="preserve">«🗺️ Дорожня карта»</w:t>
-      </w:r>
-      <w:r>
-        <w:t xml:space="preserve"> </w:t>
-      </w:r>
-      <w:r>
-        <w:t xml:space="preserve">— етапи (контрольні точки) проєкту у вигляді карток, кожна з:</w:t>
-      </w:r>
-    </w:p>
-    <w:p>
-      <w:pPr>
-        <w:numPr>
-          <w:ilvl w:val="0"/>
-          <w:numId w:val="1009"/>
-        </w:numPr>
-        <w:pStyle w:val="Compact"/>
-      </w:pPr>
-      <w:r>
-        <w:t xml:space="preserve">статусом (заплановано / у процесі / завершено / затримується) — змінюється одразу у випадаючому списку;</w:t>
-      </w:r>
-    </w:p>
-    <w:p>
-      <w:pPr>
-        <w:numPr>
-          <w:ilvl w:val="0"/>
-          <w:numId w:val="1009"/>
-        </w:numPr>
-        <w:pStyle w:val="Compact"/>
-      </w:pPr>
-      <w:r>
-        <w:t xml:space="preserve">цільовою датою (якщо вказана) — якщо вона в минулому, а етап ще не завершено, поруч автоматично з'являється бейдж «⚠️ Прострочено» (незалежно від того, чи хтось вручну обрав статус «затримується»);</w:t>
-      </w:r>
-    </w:p>
-    <w:p>
-      <w:pPr>
-        <w:numPr>
-          <w:ilvl w:val="0"/>
-          <w:numId w:val="1009"/>
-        </w:numPr>
-        <w:pStyle w:val="Compact"/>
-      </w:pPr>
-      <w:r>
-        <w:t xml:space="preserve">прогрес-баром і лічильником задач («N з M задач закрито») — рахується автоматично на основі задач, прив'язаних до цього етапу;</w:t>
-      </w:r>
-    </w:p>
-    <w:p>
-      <w:pPr>
-        <w:numPr>
-          <w:ilvl w:val="0"/>
-          <w:numId w:val="1009"/>
-        </w:numPr>
-        <w:pStyle w:val="Compact"/>
-      </w:pPr>
-      <w:r>
-        <w:t xml:space="preserve">списком самих прив'язаних задач (закриті — перекреслені).</w:t>
-      </w:r>
-    </w:p>
-    <w:p>
-      <w:pPr>
-        <w:pStyle w:val="BlockText"/>
-      </w:pPr>
-      <w:r>
-        <w:t xml:space="preserve">Створювати та видаляти етапи можуть лише ролі «Адміністратор системи» та «Керівник ІТ-підрозділу». Змінювати статус уже створеного етапу може будь-хто з доступом до проєкту. Видалення етапу</w:t>
-      </w:r>
-      <w:r>
-        <w:t xml:space="preserve"> </w:t>
-      </w:r>
-      <w:r>
-        <w:rPr>
-          <w:bCs/>
-          <w:b/>
-        </w:rPr>
-        <w:t xml:space="preserve">не видаляє</w:t>
-      </w:r>
-      <w:r>
-        <w:t xml:space="preserve"> </w:t>
-      </w:r>
-      <w:r>
-        <w:t xml:space="preserve">прив'язані задачі — вони просто втрачають прив'язку до цього етапу і лишаються в проєкті.</w:t>
-      </w:r>
-    </w:p>
-    <w:p>
-      <w:pPr>
-        <w:pStyle w:val="FirstParagraph"/>
-      </w:pPr>
-      <w:r>
-        <w:t xml:space="preserve">Прив'язати задачу до етапу можна при її створенні (розділ 4.1) або пізніше на сторінці самої задачі — там же можна й зняти прив'язку, обравши «— не прив'язано —».</w:t>
-      </w:r>
-    </w:p>
-    <w:p>
-      <w:pPr>
-        <w:pStyle w:val="BodyText"/>
-      </w:pPr>
-      <w:r>
-        <w:t xml:space="preserve">Проєкт із хоча б одним простроченим етапом позначається бейджем «⚠️ Прострочено етап» на картці в списку</w:t>
-      </w:r>
-      <w:r>
-        <w:t xml:space="preserve"> </w:t>
-      </w:r>
-      <w:r>
-        <w:rPr>
-          <w:rStyle w:val="VerbatimChar"/>
-        </w:rPr>
-        <w:t xml:space="preserve">/projects</w:t>
-      </w:r>
-      <w:r>
-        <w:t xml:space="preserve"> </w:t>
-      </w:r>
-      <w:r>
-        <w:t xml:space="preserve">і на сторінці самого проєкту.</w:t>
-      </w:r>
-    </w:p>
-    <w:bookmarkEnd w:id="31"/>
-    <w:bookmarkStart w:id="32" w:name="X156b9daba6f226d7f56608f44dae08633c2a840"/>
-    <w:p>
-      <w:pPr>
-        <w:pStyle w:val="Heading3"/>
-      </w:pPr>
-      <w:r>
-        <w:t xml:space="preserve">4.8 Облік часу по проєкту</w:t>
-      </w:r>
-    </w:p>
-    <w:p>
-      <w:pPr>
-        <w:pStyle w:val="FirstParagraph"/>
-      </w:pPr>
-      <w:r>
-        <w:t xml:space="preserve">На сторінці проєкту натисніть</w:t>
-      </w:r>
-      <w:r>
-        <w:t xml:space="preserve"> </w:t>
-      </w:r>
-      <w:r>
-        <w:rPr>
-          <w:bCs/>
-          <w:b/>
-        </w:rPr>
-        <w:t xml:space="preserve">«⏱️ Облік часу»</w:t>
-      </w:r>
-      <w:r>
-        <w:t xml:space="preserve"> </w:t>
-      </w:r>
-      <w:r>
-        <w:t xml:space="preserve">— зведена сторінка з чотирьох частин:</w:t>
-      </w:r>
-    </w:p>
-    <w:p>
-      <w:pPr>
-        <w:numPr>
-          <w:ilvl w:val="0"/>
-          <w:numId w:val="1010"/>
-        </w:numPr>
-        <w:pStyle w:val="Compact"/>
-      </w:pPr>
-      <w:r>
-        <w:rPr>
-          <w:bCs/>
-          <w:b/>
-        </w:rPr>
-        <w:t xml:space="preserve">Загальна сума годин</w:t>
-      </w:r>
-      <w:r>
-        <w:t xml:space="preserve"> </w:t>
-      </w:r>
-      <w:r>
-        <w:t xml:space="preserve">по всьому проєкту одразу.</w:t>
-      </w:r>
-    </w:p>
-    <w:p>
-      <w:pPr>
-        <w:numPr>
-          <w:ilvl w:val="0"/>
-          <w:numId w:val="1010"/>
-        </w:numPr>
-        <w:pStyle w:val="Compact"/>
-      </w:pPr>
-      <w:r>
-        <w:rPr>
-          <w:bCs/>
-          <w:b/>
-        </w:rPr>
-        <w:t xml:space="preserve">Розбивка за період</w:t>
-      </w:r>
-      <w:r>
-        <w:t xml:space="preserve"> </w:t>
-      </w:r>
-      <w:r>
-        <w:t xml:space="preserve">— три вкладки: «По днях», «По тижнях» (тиждень рахується за ISO 8601, з понеділка), «По місяцях». У кожній — дві таблиці поруч: скільки годин витрачено в кожен конкретний день/тиждень/місяць загалом, і скільки — з розбивкою по кожному учаснику окремо (та сама сума, тільки по особах).</w:t>
-      </w:r>
-    </w:p>
-    <w:p>
-      <w:pPr>
-        <w:numPr>
-          <w:ilvl w:val="0"/>
-          <w:numId w:val="1010"/>
-        </w:numPr>
-        <w:pStyle w:val="Compact"/>
-      </w:pPr>
-      <w:r>
-        <w:rPr>
-          <w:bCs/>
-          <w:b/>
-        </w:rPr>
-        <w:t xml:space="preserve">Розбивка по учасниках</w:t>
-      </w:r>
-      <w:r>
-        <w:t xml:space="preserve"> </w:t>
-      </w:r>
-      <w:r>
-        <w:t xml:space="preserve">— хто скільки годин витратив, від найбільшого до найменшого.</w:t>
-      </w:r>
-    </w:p>
-    <w:p>
-      <w:pPr>
-        <w:numPr>
-          <w:ilvl w:val="0"/>
-          <w:numId w:val="1010"/>
-        </w:numPr>
-        <w:pStyle w:val="Compact"/>
-      </w:pPr>
-      <w:r>
-        <w:rPr>
-          <w:bCs/>
-          <w:b/>
-        </w:rPr>
-        <w:t xml:space="preserve">Повний список усіх записів</w:t>
-      </w:r>
-      <w:r>
-        <w:t xml:space="preserve"> </w:t>
-      </w:r>
-      <w:r>
-        <w:t xml:space="preserve">по всіх задачах проєкту — дата, задача (з посиланням), хто, скільки годин, категорія.</w:t>
-      </w:r>
-    </w:p>
-    <w:p>
-      <w:pPr>
-        <w:pStyle w:val="FirstParagraph"/>
-      </w:pPr>
-      <w:r>
-        <w:t xml:space="preserve">Це те саме, що й окремі записи на сторінках задач (розділ 4.4), лише зібрані і згруповані в одному місці для проєкту в цілому.</w:t>
-      </w:r>
-    </w:p>
-    <w:bookmarkEnd w:id="32"/>
-    <w:bookmarkStart w:id="33" w:name="Xe6558fff4c7d4a539ce4787d39efff944a87732"/>
-    <w:p>
-      <w:pPr>
-        <w:pStyle w:val="Heading3"/>
-      </w:pPr>
-      <w:r>
-        <w:t xml:space="preserve">4.9 Вкладення до задачі</w:t>
-      </w:r>
-    </w:p>
-    <w:p>
-      <w:pPr>
-        <w:pStyle w:val="FirstParagraph"/>
-      </w:pPr>
-      <w:r>
         <w:t xml:space="preserve">На сторінці задачі є блок</w:t>
       </w:r>
       <w:r>
@@ -2024,7 +1952,7 @@
       <w:pPr>
         <w:numPr>
           <w:ilvl w:val="0"/>
-          <w:numId w:val="1011"/>
+          <w:numId w:val="1004"/>
         </w:numPr>
         <w:pStyle w:val="Compact"/>
       </w:pPr>
@@ -2046,7 +1974,7 @@
       <w:pPr>
         <w:numPr>
           <w:ilvl w:val="0"/>
-          <w:numId w:val="1011"/>
+          <w:numId w:val="1004"/>
         </w:numPr>
         <w:pStyle w:val="Compact"/>
       </w:pPr>
@@ -2081,7 +2009,7 @@
       <w:pPr>
         <w:numPr>
           <w:ilvl w:val="0"/>
-          <w:numId w:val="1011"/>
+          <w:numId w:val="1004"/>
         </w:numPr>
         <w:pStyle w:val="Compact"/>
       </w:pPr>
@@ -2103,7 +2031,7 @@
       <w:pPr>
         <w:numPr>
           <w:ilvl w:val="0"/>
-          <w:numId w:val="1011"/>
+          <w:numId w:val="1004"/>
         </w:numPr>
         <w:pStyle w:val="Compact"/>
       </w:pPr>
@@ -2134,14 +2062,14 @@
         <w:t xml:space="preserve"> </w:t>
       </w:r>
       <w:r>
-        <w:t xml:space="preserve">зберігає його на комп'ютер.</w:t>
-      </w:r>
-    </w:p>
-    <w:p>
-      <w:pPr>
-        <w:numPr>
-          <w:ilvl w:val="0"/>
-          <w:numId w:val="1011"/>
+        <w:t xml:space="preserve">зберігає його на комп’ютер.</w:t>
+      </w:r>
+    </w:p>
+    <w:p>
+      <w:pPr>
+        <w:numPr>
+          <w:ilvl w:val="0"/>
+          <w:numId w:val="1004"/>
         </w:numPr>
         <w:pStyle w:val="Compact"/>
       </w:pPr>
@@ -2163,7 +2091,7 @@
       <w:pPr>
         <w:numPr>
           <w:ilvl w:val="0"/>
-          <w:numId w:val="1011"/>
+          <w:numId w:val="1004"/>
         </w:numPr>
         <w:pStyle w:val="Compact"/>
       </w:pPr>
@@ -2185,7 +2113,7 @@
       <w:pPr>
         <w:numPr>
           <w:ilvl w:val="0"/>
-          <w:numId w:val="1011"/>
+          <w:numId w:val="1004"/>
         </w:numPr>
         <w:pStyle w:val="Compact"/>
       </w:pPr>
@@ -2215,7 +2143,7 @@
     </w:p>
     <w:bookmarkEnd w:id="33"/>
     <w:bookmarkEnd w:id="34"/>
-    <w:bookmarkStart w:id="35" w:name="X2f2f700c81453342d9b7a005b842b48ecc5069f"/>
+    <w:bookmarkStart w:id="35" w:name="календар"/>
     <w:p>
       <w:pPr>
         <w:pStyle w:val="Heading2"/>
@@ -2252,7 +2180,7 @@
       <w:pPr>
         <w:numPr>
           <w:ilvl w:val="0"/>
-          <w:numId w:val="1012"/>
+          <w:numId w:val="1005"/>
         </w:numPr>
         <w:pStyle w:val="Compact"/>
       </w:pPr>
@@ -2293,7 +2221,7 @@
       <w:pPr>
         <w:numPr>
           <w:ilvl w:val="0"/>
-          <w:numId w:val="1012"/>
+          <w:numId w:val="1005"/>
         </w:numPr>
         <w:pStyle w:val="Compact"/>
       </w:pPr>
@@ -2305,7 +2233,7 @@
       <w:pPr>
         <w:numPr>
           <w:ilvl w:val="0"/>
-          <w:numId w:val="1012"/>
+          <w:numId w:val="1005"/>
         </w:numPr>
         <w:pStyle w:val="Compact"/>
       </w:pPr>
@@ -2317,7 +2245,7 @@
       <w:pPr>
         <w:numPr>
           <w:ilvl w:val="0"/>
-          <w:numId w:val="1012"/>
+          <w:numId w:val="1005"/>
         </w:numPr>
         <w:pStyle w:val="Compact"/>
       </w:pPr>
@@ -2329,7 +2257,7 @@
       <w:pPr>
         <w:numPr>
           <w:ilvl w:val="0"/>
-          <w:numId w:val="1012"/>
+          <w:numId w:val="1005"/>
         </w:numPr>
         <w:pStyle w:val="Compact"/>
       </w:pPr>
@@ -2377,7 +2305,7 @@
       </w:r>
     </w:p>
     <w:bookmarkEnd w:id="35"/>
-    <w:bookmarkStart w:id="36" w:name="X8e9c35bc91409514cbb85f0195f01e6d00b3c48"/>
+    <w:bookmarkStart w:id="36" w:name="звіти"/>
     <w:p>
       <w:pPr>
         <w:pStyle w:val="Heading2"/>
@@ -2414,7 +2342,7 @@
       <w:pPr>
         <w:numPr>
           <w:ilvl w:val="0"/>
-          <w:numId w:val="1013"/>
+          <w:numId w:val="1006"/>
         </w:numPr>
         <w:pStyle w:val="Compact"/>
       </w:pPr>
@@ -2436,7 +2364,7 @@
       <w:pPr>
         <w:numPr>
           <w:ilvl w:val="0"/>
-          <w:numId w:val="1013"/>
+          <w:numId w:val="1006"/>
         </w:numPr>
         <w:pStyle w:val="Compact"/>
       </w:pPr>
@@ -2451,14 +2379,14 @@
         <w:t xml:space="preserve"> </w:t>
       </w:r>
       <w:r>
-        <w:t xml:space="preserve">(необов'язково) — залиште «усі доступні проєкти» або оберіть один конкретний. Список містить лише проєкти, до яких у вас є доступ. Якщо обраний проєкт має підпроєкти — їхні записи автоматично потрапляють у звіт теж, кожен своєю окремою секцією в таблиці (див. нижче).</w:t>
-      </w:r>
-    </w:p>
-    <w:p>
-      <w:pPr>
-        <w:numPr>
-          <w:ilvl w:val="0"/>
-          <w:numId w:val="1013"/>
+        <w:t xml:space="preserve">(необов’язково) — залиште «усі доступні проєкти» або оберіть один конкретний. Список містить лише проєкти, до яких у вас є доступ. Якщо обраний проєкт має підпроєкти — їхні записи автоматично потрапляють у звіт теж, кожен своєю окремою секцією в таблиці (див. нижче).</w:t>
+      </w:r>
+    </w:p>
+    <w:p>
+      <w:pPr>
+        <w:numPr>
+          <w:ilvl w:val="0"/>
+          <w:numId w:val="1006"/>
         </w:numPr>
         <w:pStyle w:val="Compact"/>
       </w:pPr>
@@ -2473,14 +2401,14 @@
         <w:t xml:space="preserve"> </w:t>
       </w:r>
       <w:r>
-        <w:t xml:space="preserve">(необов'язково) — щоб побачити облік часу лише однієї людини.</w:t>
-      </w:r>
-    </w:p>
-    <w:p>
-      <w:pPr>
-        <w:numPr>
-          <w:ilvl w:val="0"/>
-          <w:numId w:val="1013"/>
+        <w:t xml:space="preserve">(необов’язково) — щоб побачити облік часу лише однієї людини.</w:t>
+      </w:r>
+    </w:p>
+    <w:p>
+      <w:pPr>
+        <w:numPr>
+          <w:ilvl w:val="0"/>
+          <w:numId w:val="1006"/>
         </w:numPr>
         <w:pStyle w:val="Compact"/>
       </w:pPr>
@@ -2495,7 +2423,7 @@
         <w:t xml:space="preserve"> </w:t>
       </w:r>
       <w:r>
-        <w:t xml:space="preserve">(необов'язково) — текстове поле з підказками вже використаних категорій; шукає за частковим збігом.</w:t>
+        <w:t xml:space="preserve">(необов’язково) — текстове поле з підказками вже використаних категорій; шукає за частковим збігом.</w:t>
       </w:r>
     </w:p>
     <w:p>
@@ -2521,15 +2449,15 @@
       <w:r>
         <w:t xml:space="preserve">— файл відкриється в новій вкладці й одразу почне завантажуватись. Звіт складається з трьох частин:</w:t>
       </w:r>
-    </w:p>
-    <w:p>
-      <w:pPr>
-        <w:numPr>
-          <w:ilvl w:val="0"/>
-          <w:numId w:val="1014"/>
-        </w:numPr>
-        <w:pStyle w:val="Compact"/>
-      </w:pPr>
+      <w:r>
+        <w:t xml:space="preserve"> </w:t>
+      </w:r>
+      <w:r>
+        <w:t xml:space="preserve">-</w:t>
+      </w:r>
+      <w:r>
+        <w:t xml:space="preserve"> </w:t>
+      </w:r>
       <w:r>
         <w:rPr>
           <w:bCs/>
@@ -2543,15 +2471,15 @@
       <w:r>
         <w:t xml:space="preserve">у шапці — горизонтальні смуги, по одній на кожного користувача, чиї записи потрапили у звіт; довжина смуги пропорційна кількості годин, поруч — точна сума.</w:t>
       </w:r>
-    </w:p>
-    <w:p>
-      <w:pPr>
-        <w:numPr>
-          <w:ilvl w:val="0"/>
-          <w:numId w:val="1014"/>
-        </w:numPr>
-        <w:pStyle w:val="Compact"/>
-      </w:pPr>
+      <w:r>
+        <w:t xml:space="preserve"> </w:t>
+      </w:r>
+      <w:r>
+        <w:t xml:space="preserve">-</w:t>
+      </w:r>
+      <w:r>
+        <w:t xml:space="preserve"> </w:t>
+      </w:r>
       <w:r>
         <w:rPr>
           <w:bCs/>
@@ -2578,15 +2506,15 @@
       <w:r>
         <w:t xml:space="preserve">— кожен проєкт своєю плашкою, під нею лише його задачі (дата, задача, користувач, категорія, години), і рядок «Витрачено на опрацювання проєкту» з підсумком. Проєкти показані від найбільшої кількості витрачених годин до найменшої.</w:t>
       </w:r>
-    </w:p>
-    <w:p>
-      <w:pPr>
-        <w:numPr>
-          <w:ilvl w:val="0"/>
-          <w:numId w:val="1014"/>
-        </w:numPr>
-        <w:pStyle w:val="Compact"/>
-      </w:pPr>
+      <w:r>
+        <w:t xml:space="preserve"> </w:t>
+      </w:r>
+      <w:r>
+        <w:t xml:space="preserve">-</w:t>
+      </w:r>
+      <w:r>
+        <w:t xml:space="preserve"> </w:t>
+      </w:r>
       <w:r>
         <w:rPr>
           <w:bCs/>
@@ -2603,7 +2531,7 @@
     </w:p>
     <w:p>
       <w:pPr>
-        <w:pStyle w:val="FirstParagraph"/>
+        <w:pStyle w:val="BodyText"/>
       </w:pPr>
       <w:r>
         <w:t xml:space="preserve">Якщо нічого не знайдено за обраними фільтрами — звіт так і повідомить, замість порожньої таблиці.</w:t>
@@ -2617,7 +2545,7 @@
       </w:r>
     </w:p>
     <w:bookmarkEnd w:id="36"/>
-    <w:bookmarkStart w:id="42" w:name="Xcc7d581a970c8299901cd28a26d07868faf2a6d"/>
+    <w:bookmarkStart w:id="42" w:name="тікети-звернення-до-іт-підтримки"/>
     <w:p>
       <w:pPr>
         <w:pStyle w:val="Heading2"/>
@@ -2684,7 +2612,7 @@
         <w:pStyle w:val="BlockText"/>
       </w:pPr>
       <w:r>
-        <w:t xml:space="preserve">Колезі без облікового запису не обов'язково створювати його заради одного звернення — сторінка</w:t>
+        <w:t xml:space="preserve">Колезі без облікового запису не обов’язково створювати його заради одного звернення — сторінка</w:t>
       </w:r>
       <w:r>
         <w:t xml:space="preserve"> </w:t>
@@ -2744,7 +2672,7 @@
         <w:t xml:space="preserve"> </w:t>
       </w:r>
       <w:r>
-        <w:t xml:space="preserve">на адресу поштової скриньки підтримки (адресу повідомить адміністратор системи) — лист автоматично стане тікетом: тема листа — темою, текст — описом. Якщо ви пишете з тієї самої адреси, що вказана у вашому обліковому записі, тікет з'явиться у вашому списку «Тікети». Відповідь у тій самій гілці листування додається коментарем до цього тікета (можна також вказати в темі номер:</w:t>
+        <w:t xml:space="preserve">на адресу поштової скриньки підтримки (адресу повідомить адміністратор системи) — лист автоматично стане тікетом: тема листа — темою, текст — описом. Якщо ви пишете з тієї самої адреси, що вказана у вашому обліковому записі, тікет з’явиться у вашому списку «Тікети». Відповідь у тій самій гілці листування додається коментарем до цього тікета (можна також вказати в темі номер:</w:t>
       </w:r>
       <w:r>
         <w:t xml:space="preserve"> </w:t>
@@ -2759,7 +2687,7 @@
         <w:t xml:space="preserve">). Зберігаються лише зображення PNG/JPG (див. нижче); решта вкладень листа до тікета не потрапляє. Якщо адміністратор увімкнув автовідповідь, у відповідь на такий лист прийде підтвердження з посиланням для відстеження статусу — навіть якщо у вас немає облікового запису в системі.</w:t>
       </w:r>
     </w:p>
-    <w:bookmarkStart w:id="37" w:name="X65f1f0f282e74129854557814c2789e5666eaa3"/>
+    <w:bookmarkStart w:id="37" w:name="створення-тікета"/>
     <w:p>
       <w:pPr>
         <w:pStyle w:val="Heading3"/>
@@ -2807,7 +2735,7 @@
         <w:pStyle w:val="BodyText"/>
       </w:pPr>
       <w:r>
-        <w:t xml:space="preserve">У формі є необов'язкове поле</w:t>
+        <w:t xml:space="preserve">У формі є необов’язкове поле</w:t>
       </w:r>
       <w:r>
         <w:t xml:space="preserve"> </w:t>
@@ -2825,15 +2753,15 @@
       <w:r>
         <w:t xml:space="preserve">(PNG або JPG, до 10 файлів) — для скриншота помилки чи фото, що допоможуть оператору зрозуміти проблему без зайвих запитань. Додати можна двома способами:</w:t>
       </w:r>
-    </w:p>
-    <w:p>
-      <w:pPr>
-        <w:numPr>
-          <w:ilvl w:val="0"/>
-          <w:numId w:val="1015"/>
-        </w:numPr>
-        <w:pStyle w:val="Compact"/>
-      </w:pPr>
+      <w:r>
+        <w:t xml:space="preserve"> </w:t>
+      </w:r>
+      <w:r>
+        <w:t xml:space="preserve">-</w:t>
+      </w:r>
+      <w:r>
+        <w:t xml:space="preserve"> </w:t>
+      </w:r>
       <w:r>
         <w:rPr>
           <w:bCs/>
@@ -2847,15 +2775,15 @@
       <w:r>
         <w:t xml:space="preserve">кнопкою «Вибрати файли»;</w:t>
       </w:r>
-    </w:p>
-    <w:p>
-      <w:pPr>
-        <w:numPr>
-          <w:ilvl w:val="0"/>
-          <w:numId w:val="1015"/>
-        </w:numPr>
-        <w:pStyle w:val="Compact"/>
-      </w:pPr>
+      <w:r>
+        <w:t xml:space="preserve"> </w:t>
+      </w:r>
+      <w:r>
+        <w:t xml:space="preserve">-</w:t>
+      </w:r>
+      <w:r>
+        <w:t xml:space="preserve"> </w:t>
+      </w:r>
       <w:r>
         <w:rPr>
           <w:bCs/>
@@ -2981,7 +2909,96 @@
         <w:t xml:space="preserve">V</w:t>
       </w:r>
       <w:r>
-        <w:t xml:space="preserve">). Скриншот з'явиться в списку.</w:t>
+        <w:t xml:space="preserve">). Скриншот з’явиться в списку.</w:t>
+      </w:r>
+    </w:p>
+    <w:p>
+      <w:pPr>
+        <w:pStyle w:val="BodyText"/>
+      </w:pPr>
+      <w:r>
+        <w:t xml:space="preserve">Усе вибране показується списком із мініатюрами; зайве можна прибрати кнопкою</w:t>
+      </w:r>
+      <w:r>
+        <w:t xml:space="preserve"> </w:t>
+      </w:r>
+      <w:r>
+        <w:rPr>
+          <w:bCs/>
+          <w:b/>
+        </w:rPr>
+        <w:t xml:space="preserve">«Прибрати»</w:t>
+      </w:r>
+      <w:r>
+        <w:t xml:space="preserve">. Якщо якийсь файл не пройде перевірку (не той формат, завеликий),</w:t>
+      </w:r>
+      <w:r>
+        <w:t xml:space="preserve"> </w:t>
+      </w:r>
+      <w:r>
+        <w:rPr>
+          <w:bCs/>
+          <w:b/>
+        </w:rPr>
+        <w:t xml:space="preserve">тікет усе одно створиться</w:t>
+      </w:r>
+      <w:r>
+        <w:t xml:space="preserve">, а на його сторінці буде написано, що саме не прикріпилось і чому. Звичайна вставка тексту (</w:t>
+      </w:r>
+      <w:r>
+        <w:rPr>
+          <w:rStyle w:val="VerbatimChar"/>
+        </w:rPr>
+        <w:t xml:space="preserve">Ctrl</w:t>
+      </w:r>
+      <w:r>
+        <w:t xml:space="preserve">+</w:t>
+      </w:r>
+      <w:r>
+        <w:rPr>
+          <w:rStyle w:val="VerbatimChar"/>
+        </w:rPr>
+        <w:t xml:space="preserve">V</w:t>
+      </w:r>
+      <w:r>
+        <w:t xml:space="preserve"> </w:t>
+      </w:r>
+      <w:r>
+        <w:t xml:space="preserve">із текстом) працює як завжди; зображення додається лише тоді, коли воно справді є в буфері обміну (якщо там і текст, і картинка, вставиться і текст, і додасться картинка). PDF у формі створення не приймається — додайте його на сторінці вже створеного тікета (розділ 7.5).</w:t>
+      </w:r>
+    </w:p>
+    <w:p>
+      <w:pPr>
+        <w:pStyle w:val="BodyText"/>
+      </w:pPr>
+      <w:r>
+        <w:t xml:space="preserve">За бажанням можна прив’язати тікет до проєкту (список показує лише ваші проєкти) — зручно, коли звернення стосується конкретної роботи над проєктом, а не загального ІТ-запиту. Якщо перейти за кнопкою</w:t>
+      </w:r>
+      <w:r>
+        <w:t xml:space="preserve"> </w:t>
+      </w:r>
+      <w:r>
+        <w:rPr>
+          <w:bCs/>
+          <w:b/>
+        </w:rPr>
+        <w:t xml:space="preserve">«+ Тікет»</w:t>
+      </w:r>
+      <w:r>
+        <w:t xml:space="preserve"> </w:t>
+      </w:r>
+      <w:r>
+        <w:t xml:space="preserve">зі сторінки самого проєкту — він одразу буде обраний у формі.</w:t>
+      </w:r>
+    </w:p>
+    <w:bookmarkEnd w:id="37"/>
+    <w:bookmarkStart w:id="38" w:name="перегляд-і-статус-тікета"/>
+    <w:p>
+      <w:pPr>
+        <w:pStyle w:val="Heading3"/>
+      </w:pPr>
+      <w:r>
+        <w:t xml:space="preserve">7.2 Перегляд і статус тікета</w:t>
       </w:r>
     </w:p>
     <w:p>
@@ -2989,88 +3006,25 @@
         <w:pStyle w:val="FirstParagraph"/>
       </w:pPr>
       <w:r>
-        <w:t xml:space="preserve">Усе вибране показується списком із мініатюрами; зайве можна прибрати кнопкою</w:t>
-      </w:r>
-      <w:r>
-        <w:t xml:space="preserve"> </w:t>
-      </w:r>
-      <w:r>
-        <w:rPr>
-          <w:bCs/>
-          <w:b/>
-        </w:rPr>
-        <w:t xml:space="preserve">«Прибрати»</w:t>
-      </w:r>
-      <w:r>
-        <w:t xml:space="preserve">. Якщо якийсь файл не пройде перевірку (не той формат, завеликий),</w:t>
-      </w:r>
-      <w:r>
-        <w:t xml:space="preserve"> </w:t>
-      </w:r>
-      <w:r>
-        <w:rPr>
-          <w:bCs/>
-          <w:b/>
-        </w:rPr>
-        <w:t xml:space="preserve">тікет усе одно створиться</w:t>
-      </w:r>
-      <w:r>
-        <w:t xml:space="preserve">, а на його сторінці буде написано, що саме не прикріпилось і чому. Звичайна вставка тексту (</w:t>
-      </w:r>
-      <w:r>
-        <w:rPr>
-          <w:rStyle w:val="VerbatimChar"/>
-        </w:rPr>
-        <w:t xml:space="preserve">Ctrl</w:t>
-      </w:r>
-      <w:r>
-        <w:t xml:space="preserve">+</w:t>
-      </w:r>
-      <w:r>
-        <w:rPr>
-          <w:rStyle w:val="VerbatimChar"/>
-        </w:rPr>
-        <w:t xml:space="preserve">V</w:t>
-      </w:r>
-      <w:r>
-        <w:t xml:space="preserve"> </w:t>
-      </w:r>
-      <w:r>
-        <w:t xml:space="preserve">із текстом) працює як завжди; зображення додається лише тоді, коли воно справді є в буфері обміну (якщо там і текст, і картинка, вставиться і текст, і додасться картинка). PDF у формі створення не приймається — додайте його на сторінці вже створеного тікета (розділ 7.5).</w:t>
-      </w:r>
-    </w:p>
-    <w:p>
-      <w:pPr>
-        <w:pStyle w:val="BodyText"/>
-      </w:pPr>
-      <w:r>
-        <w:t xml:space="preserve">За бажанням можна прив'язати тікет до проєкту (список показує лише ваші проєкти) — зручно, коли звернення стосується конкретної роботи над проєктом, а не загального ІТ-запиту. Якщо перейти за кнопкою</w:t>
-      </w:r>
-      <w:r>
-        <w:t xml:space="preserve"> </w:t>
-      </w:r>
-      <w:r>
-        <w:rPr>
-          <w:bCs/>
-          <w:b/>
-        </w:rPr>
-        <w:t xml:space="preserve">«+ Тікет»</w:t>
-      </w:r>
-      <w:r>
-        <w:t xml:space="preserve"> </w:t>
-      </w:r>
-      <w:r>
-        <w:t xml:space="preserve">зі сторінки самого проєкту — він одразу буде обраний у формі.</w:t>
-      </w:r>
-    </w:p>
-    <w:bookmarkEnd w:id="37"/>
-    <w:bookmarkStart w:id="38" w:name="X566bfbc1a38dd856c2a3fddc831d3ee32711b56"/>
+        <w:t xml:space="preserve">На сторінці тікета видно чергу, прив’язаний проєкт (якщо є), ваші дані як заявника та листування. Змінити статус (наприклад, позначити як вирішений) можна там само у випадаючому списку. Якщо адміністратор увімкнув email-сповіщення, про зміну статусу листом дізнається заявник і призначений оператор (крім того, хто саме цю зміну зробив).</w:t>
+      </w:r>
+    </w:p>
+    <w:p>
+      <w:pPr>
+        <w:pStyle w:val="BlockText"/>
+      </w:pPr>
+      <w:r>
+        <w:t xml:space="preserve">Призначати оператора (виконавця) тікета можуть лише керівник ІТ-підрозділу, адміністратор системи або оператор служби підтримки — рядовий користувач лише бачить, хто вже призначений.</w:t>
+      </w:r>
+    </w:p>
+    <w:bookmarkEnd w:id="38"/>
+    <w:bookmarkStart w:id="39" w:name="листування"/>
     <w:p>
       <w:pPr>
         <w:pStyle w:val="Heading3"/>
       </w:pPr>
       <w:r>
-        <w:t xml:space="preserve">7.2 Перегляд і статус тікета</w:t>
+        <w:t xml:space="preserve">7.3 Листування</w:t>
       </w:r>
     </w:p>
     <w:p>
@@ -3078,25 +3032,33 @@
         <w:pStyle w:val="FirstParagraph"/>
       </w:pPr>
       <w:r>
-        <w:t xml:space="preserve">На сторінці тікета видно чергу, прив'язаний проєкт (якщо є), ваші дані як заявника та листування. Змінити статус (наприклад, позначити як вирішений) можна там само у випадаючому списку. Якщо адміністратор увімкнув email-сповіщення, про зміну статусу листом дізнається заявник і призначений оператор (крім того, хто саме цю зміну зробив).</w:t>
-      </w:r>
-    </w:p>
-    <w:p>
-      <w:pPr>
-        <w:pStyle w:val="BlockText"/>
-      </w:pPr>
-      <w:r>
-        <w:t xml:space="preserve">Призначати оператора (виконавця) тікета можуть лише керівник ІТ-підрозділу, адміністратор системи або оператор служби підтримки — рядовий користувач лише бачить, хто вже призначений.</w:t>
-      </w:r>
-    </w:p>
-    <w:bookmarkEnd w:id="38"/>
-    <w:bookmarkStart w:id="39" w:name="Xf60126fbe4e6ae54e98a7bfc16e401fa0ba049f"/>
+        <w:t xml:space="preserve">Внизу сторінки тікета — стрічка повідомлень. Напишіть відповідь і натисніть</w:t>
+      </w:r>
+      <w:r>
+        <w:t xml:space="preserve"> </w:t>
+      </w:r>
+      <w:r>
+        <w:rPr>
+          <w:bCs/>
+          <w:b/>
+        </w:rPr>
+        <w:t xml:space="preserve">«Надіслати»</w:t>
+      </w:r>
+      <w:r>
+        <w:t xml:space="preserve"> </w:t>
+      </w:r>
+      <w:r>
+        <w:t xml:space="preserve">— вона додасться до листування з позначкою, від оператора вона чи від заявника. Якщо email-сповіщення увімкнені, про нове повідомлення листом дізнається інша сторона — відповідь оператора надійде заявнику, відповідь заявника — призначеному оператору.</w:t>
+      </w:r>
+    </w:p>
+    <w:bookmarkEnd w:id="39"/>
+    <w:bookmarkStart w:id="40" w:name="оцінка-вирішення-csat"/>
     <w:p>
       <w:pPr>
         <w:pStyle w:val="Heading3"/>
       </w:pPr>
       <w:r>
-        <w:t xml:space="preserve">7.3 Листування</w:t>
+        <w:t xml:space="preserve">7.4 Оцінка вирішення (CSAT)</w:t>
       </w:r>
     </w:p>
     <w:p>
@@ -3104,33 +3066,150 @@
         <w:pStyle w:val="FirstParagraph"/>
       </w:pPr>
       <w:r>
-        <w:t xml:space="preserve">Внизу сторінки тікета — стрічка повідомлень. Напишіть відповідь і натисніть</w:t>
-      </w:r>
-      <w:r>
-        <w:t xml:space="preserve"> </w:t>
-      </w:r>
-      <w:r>
-        <w:rPr>
-          <w:bCs/>
-          <w:b/>
-        </w:rPr>
-        <w:t xml:space="preserve">«Надіслати»</w:t>
-      </w:r>
-      <w:r>
-        <w:t xml:space="preserve"> </w:t>
-      </w:r>
-      <w:r>
-        <w:t xml:space="preserve">— вона додасться до листування з позначкою, від оператора вона чи від заявника. Якщо email-сповіщення увімкнені, про нове повідомлення листом дізнається інша сторона — відповідь оператора надійде заявнику, відповідь заявника — призначеному оператору.</w:t>
-      </w:r>
-    </w:p>
-    <w:bookmarkEnd w:id="39"/>
-    <w:bookmarkStart w:id="40" w:name="X27c8890bba55310c393b34a574dee6871a36f5c"/>
+        <w:t xml:space="preserve">Коли ваше звернення має статус</w:t>
+      </w:r>
+      <w:r>
+        <w:t xml:space="preserve"> </w:t>
+      </w:r>
+      <w:r>
+        <w:rPr>
+          <w:bCs/>
+          <w:b/>
+        </w:rPr>
+        <w:t xml:space="preserve">«Вирішено»</w:t>
+      </w:r>
+      <w:r>
+        <w:t xml:space="preserve"> </w:t>
+      </w:r>
+      <w:r>
+        <w:t xml:space="preserve">або</w:t>
+      </w:r>
+      <w:r>
+        <w:t xml:space="preserve"> </w:t>
+      </w:r>
+      <w:r>
+        <w:rPr>
+          <w:bCs/>
+          <w:b/>
+        </w:rPr>
+        <w:t xml:space="preserve">«Закрито»</w:t>
+      </w:r>
+      <w:r>
+        <w:t xml:space="preserve">, внизу сторінки тікета, під листуванням, з’являється запитання</w:t>
+      </w:r>
+      <w:r>
+        <w:t xml:space="preserve"> </w:t>
+      </w:r>
+      <w:r>
+        <w:rPr>
+          <w:bCs/>
+          <w:b/>
+        </w:rPr>
+        <w:t xml:space="preserve">«Наскільки ви задоволені вирішенням звернення?»</w:t>
+      </w:r>
+      <w:r>
+        <w:t xml:space="preserve"> </w:t>
+      </w:r>
+      <w:r>
+        <w:t xml:space="preserve">і п’ять кнопок від 1 до 5 (1 — незадовільно, 5 — відмінно). Натисніть потрібну — вгорі сторінки з’явиться «Дякуємо за оцінку!», а кнопки замінить напис «Дякуємо, ви вже оцінили це звернення: N з 5».</w:t>
+      </w:r>
+    </w:p>
+    <w:p>
+      <w:pPr>
+        <w:numPr>
+          <w:ilvl w:val="0"/>
+          <w:numId w:val="1007"/>
+        </w:numPr>
+        <w:pStyle w:val="Compact"/>
+      </w:pPr>
+      <w:r>
+        <w:t xml:space="preserve">Оцінити можна</w:t>
+      </w:r>
+      <w:r>
+        <w:t xml:space="preserve"> </w:t>
+      </w:r>
+      <w:r>
+        <w:rPr>
+          <w:bCs/>
+          <w:b/>
+        </w:rPr>
+        <w:t xml:space="preserve">лише один раз</w:t>
+      </w:r>
+      <w:r>
+        <w:t xml:space="preserve"> </w:t>
+      </w:r>
+      <w:r>
+        <w:t xml:space="preserve">— змінити її потім не можна.</w:t>
+      </w:r>
+    </w:p>
+    <w:p>
+      <w:pPr>
+        <w:numPr>
+          <w:ilvl w:val="0"/>
+          <w:numId w:val="1007"/>
+        </w:numPr>
+        <w:pStyle w:val="Compact"/>
+      </w:pPr>
+      <w:r>
+        <w:t xml:space="preserve">Оцінити може</w:t>
+      </w:r>
+      <w:r>
+        <w:t xml:space="preserve"> </w:t>
+      </w:r>
+      <w:r>
+        <w:rPr>
+          <w:bCs/>
+          <w:b/>
+        </w:rPr>
+        <w:t xml:space="preserve">лише заявник</w:t>
+      </w:r>
+      <w:r>
+        <w:t xml:space="preserve"> </w:t>
+      </w:r>
+      <w:r>
+        <w:t xml:space="preserve">— той, хто створив звернення. Оператор чи адміністратор, відкривши ваш тікет, оцінку лише бачать.</w:t>
+      </w:r>
+    </w:p>
+    <w:p>
+      <w:pPr>
+        <w:numPr>
+          <w:ilvl w:val="0"/>
+          <w:numId w:val="1007"/>
+        </w:numPr>
+        <w:pStyle w:val="Compact"/>
+      </w:pPr>
+      <w:r>
+        <w:t xml:space="preserve">Якщо звернення ще не вирішено (статуси «Новий», «В роботі», «Очікує відповіді»), кнопок немає.</w:t>
+      </w:r>
+    </w:p>
+    <w:p>
+      <w:pPr>
+        <w:numPr>
+          <w:ilvl w:val="0"/>
+          <w:numId w:val="1007"/>
+        </w:numPr>
+        <w:pStyle w:val="Compact"/>
+      </w:pPr>
+      <w:r>
+        <w:t xml:space="preserve">Оцінка допомагає ІТ-підрозділу бачити якість обслуговування: адміністратор переглядає середні оцінки по чергах і по операторах.</w:t>
+      </w:r>
+    </w:p>
+    <w:p>
+      <w:pPr>
+        <w:pStyle w:val="FirstParagraph"/>
+      </w:pPr>
+      <w:r>
+        <w:t xml:space="preserve">Те саме працює й для звернень, поданих через портал самообслуговування без входу в систему, — кнопки оцінки з’являються на сторінці відстеження за вашим персональним посиланням.</w:t>
+      </w:r>
+    </w:p>
+    <w:bookmarkEnd w:id="40"/>
+    <w:bookmarkStart w:id="41" w:name="вкладення-тікета"/>
     <w:p>
       <w:pPr>
         <w:pStyle w:val="Heading3"/>
       </w:pPr>
       <w:r>
-        <w:t xml:space="preserve">7.4 Оцінка вирішення (CSAT)</w:t>
+        <w:t xml:space="preserve">7.5 Вкладення тікета</w:t>
       </w:r>
     </w:p>
     <w:p>
@@ -3138,157 +3217,6 @@
         <w:pStyle w:val="FirstParagraph"/>
       </w:pPr>
       <w:r>
-        <w:t xml:space="preserve">Коли ваше звернення має статус</w:t>
-      </w:r>
-      <w:r>
-        <w:t xml:space="preserve"> </w:t>
-      </w:r>
-      <w:r>
-        <w:rPr>
-          <w:bCs/>
-          <w:b/>
-        </w:rPr>
-        <w:t xml:space="preserve">«Вирішено»</w:t>
-      </w:r>
-      <w:r>
-        <w:t xml:space="preserve"> </w:t>
-      </w:r>
-      <w:r>
-        <w:t xml:space="preserve">або</w:t>
-      </w:r>
-      <w:r>
-        <w:t xml:space="preserve"> </w:t>
-      </w:r>
-      <w:r>
-        <w:rPr>
-          <w:bCs/>
-          <w:b/>
-        </w:rPr>
-        <w:t xml:space="preserve">«Закрито»</w:t>
-      </w:r>
-      <w:r>
-        <w:t xml:space="preserve">, внизу сторінки тікета, під листуванням, з'являється запитання</w:t>
-      </w:r>
-      <w:r>
-        <w:t xml:space="preserve"> </w:t>
-      </w:r>
-      <w:r>
-        <w:rPr>
-          <w:bCs/>
-          <w:b/>
-        </w:rPr>
-        <w:t xml:space="preserve">«Наскільки ви задоволені вирішенням звернення?»</w:t>
-      </w:r>
-      <w:r>
-        <w:t xml:space="preserve"> </w:t>
-      </w:r>
-      <w:r>
-        <w:t xml:space="preserve">і п'ять кнопок від 1 до 5 (1 — незадовільно, 5 — відмінно). Натисніть потрібну — вгорі сторінки з'явиться «Дякуємо за оцінку!», а кнопки замінить напис «Дякуємо, ви вже оцінили це звернення: N з 5».</w:t>
-      </w:r>
-    </w:p>
-    <w:p>
-      <w:pPr>
-        <w:numPr>
-          <w:ilvl w:val="0"/>
-          <w:numId w:val="1016"/>
-        </w:numPr>
-        <w:pStyle w:val="Compact"/>
-      </w:pPr>
-      <w:r>
-        <w:t xml:space="preserve">Оцінити можна</w:t>
-      </w:r>
-      <w:r>
-        <w:t xml:space="preserve"> </w:t>
-      </w:r>
-      <w:r>
-        <w:rPr>
-          <w:bCs/>
-          <w:b/>
-        </w:rPr>
-        <w:t xml:space="preserve">лише один раз</w:t>
-      </w:r>
-      <w:r>
-        <w:t xml:space="preserve"> </w:t>
-      </w:r>
-      <w:r>
-        <w:t xml:space="preserve">— змінити її потім не можна.</w:t>
-      </w:r>
-    </w:p>
-    <w:p>
-      <w:pPr>
-        <w:numPr>
-          <w:ilvl w:val="0"/>
-          <w:numId w:val="1016"/>
-        </w:numPr>
-        <w:pStyle w:val="Compact"/>
-      </w:pPr>
-      <w:r>
-        <w:t xml:space="preserve">Оцінити може</w:t>
-      </w:r>
-      <w:r>
-        <w:t xml:space="preserve"> </w:t>
-      </w:r>
-      <w:r>
-        <w:rPr>
-          <w:bCs/>
-          <w:b/>
-        </w:rPr>
-        <w:t xml:space="preserve">лише заявник</w:t>
-      </w:r>
-      <w:r>
-        <w:t xml:space="preserve"> </w:t>
-      </w:r>
-      <w:r>
-        <w:t xml:space="preserve">— той, хто створив звернення. Оператор чи адміністратор, відкривши ваш тікет, оцінку лише бачать.</w:t>
-      </w:r>
-    </w:p>
-    <w:p>
-      <w:pPr>
-        <w:numPr>
-          <w:ilvl w:val="0"/>
-          <w:numId w:val="1016"/>
-        </w:numPr>
-        <w:pStyle w:val="Compact"/>
-      </w:pPr>
-      <w:r>
-        <w:t xml:space="preserve">Якщо звернення ще не вирішено (статуси «Новий», «В роботі», «Очікує відповіді»), кнопок немає.</w:t>
-      </w:r>
-    </w:p>
-    <w:p>
-      <w:pPr>
-        <w:numPr>
-          <w:ilvl w:val="0"/>
-          <w:numId w:val="1016"/>
-        </w:numPr>
-        <w:pStyle w:val="Compact"/>
-      </w:pPr>
-      <w:r>
-        <w:t xml:space="preserve">Оцінка допомагає ІТ-підрозділу бачити якість обслуговування: адміністратор переглядає середні оцінки по чергах і по операторах.</w:t>
-      </w:r>
-    </w:p>
-    <w:p>
-      <w:pPr>
-        <w:pStyle w:val="FirstParagraph"/>
-      </w:pPr>
-      <w:r>
-        <w:t xml:space="preserve">Те саме працює й для звернень, поданих через портал самообслуговування без входу в систему, — кнопки оцінки з'являються на сторінці відстеження за вашим персональним посиланням.</w:t>
-      </w:r>
-    </w:p>
-    <w:bookmarkEnd w:id="40"/>
-    <w:bookmarkStart w:id="41" w:name="Xd1b2dc32ce815bb538e73e3fd9ed2af3f4597b6"/>
-    <w:p>
-      <w:pPr>
-        <w:pStyle w:val="Heading3"/>
-      </w:pPr>
-      <w:r>
-        <w:t xml:space="preserve">7.5 Вкладення тікета</w:t>
-      </w:r>
-    </w:p>
-    <w:p>
-      <w:pPr>
-        <w:pStyle w:val="FirstParagraph"/>
-      </w:pPr>
-      <w:r>
         <w:t xml:space="preserve">Файли можна прикріпити й</w:t>
       </w:r>
       <w:r>
@@ -3341,7 +3269,7 @@
       <w:pPr>
         <w:numPr>
           <w:ilvl w:val="0"/>
-          <w:numId w:val="1017"/>
+          <w:numId w:val="1008"/>
         </w:numPr>
         <w:pStyle w:val="Compact"/>
       </w:pPr>
@@ -3353,12 +3281,12 @@
       <w:pPr>
         <w:numPr>
           <w:ilvl w:val="0"/>
-          <w:numId w:val="1017"/>
-        </w:numPr>
-        <w:pStyle w:val="Compact"/>
-      </w:pPr>
-      <w:r>
-        <w:t xml:space="preserve">Біля кожного файлу написано, хто його додав: ім'я користувача,</w:t>
+          <w:numId w:val="1008"/>
+        </w:numPr>
+        <w:pStyle w:val="Compact"/>
+      </w:pPr>
+      <w:r>
+        <w:t xml:space="preserve">Біля кожного файлу написано, хто його додав: ім’я користувача,</w:t>
       </w:r>
       <w:r>
         <w:t xml:space="preserve"> </w:t>
@@ -3397,7 +3325,7 @@
       <w:pPr>
         <w:numPr>
           <w:ilvl w:val="0"/>
-          <w:numId w:val="1017"/>
+          <w:numId w:val="1008"/>
         </w:numPr>
         <w:pStyle w:val="Compact"/>
       </w:pPr>
@@ -3445,7 +3373,7 @@
     </w:p>
     <w:bookmarkEnd w:id="41"/>
     <w:bookmarkEnd w:id="42"/>
-    <w:bookmarkStart w:id="43" w:name="Xc2a034ab61973d280507f8c5fe62099dfdd736c"/>
+    <w:bookmarkStart w:id="44" w:name="мій-профіль-і-пароль"/>
     <w:p>
       <w:pPr>
         <w:pStyle w:val="Heading2"/>
@@ -3459,7 +3387,7 @@
         <w:pStyle w:val="FirstParagraph"/>
       </w:pPr>
       <w:r>
-        <w:t xml:space="preserve">Натисніть на своє ім'я у верхньому правому куті (поруч із кнопкою «Вийти») — відкриється сторінка</w:t>
+        <w:t xml:space="preserve">Натисніть на своє ім’я у верхньому правому куті (поруч із кнопкою «Вийти») — відкриється сторінка</w:t>
       </w:r>
       <w:r>
         <w:t xml:space="preserve"> </w:t>
@@ -3475,14 +3403,14 @@
         <w:t xml:space="preserve"> </w:t>
       </w:r>
       <w:r>
-        <w:t xml:space="preserve">з двома блоками:</w:t>
-      </w:r>
-    </w:p>
-    <w:p>
-      <w:pPr>
-        <w:numPr>
-          <w:ilvl w:val="0"/>
-          <w:numId w:val="1018"/>
+        <w:t xml:space="preserve">з двома блоками (а коли адміністратор увімкнув REST API — ще й третім, «Токени доступу до API», див. нижче):</w:t>
+      </w:r>
+    </w:p>
+    <w:p>
+      <w:pPr>
+        <w:numPr>
+          <w:ilvl w:val="0"/>
+          <w:numId w:val="1009"/>
         </w:numPr>
         <w:pStyle w:val="Compact"/>
       </w:pPr>
@@ -3497,14 +3425,14 @@
         <w:t xml:space="preserve"> </w:t>
       </w:r>
       <w:r>
-        <w:t xml:space="preserve">— ім'я, email, роль, тип автентифікації (тільки для перегляду).</w:t>
-      </w:r>
-    </w:p>
-    <w:p>
-      <w:pPr>
-        <w:numPr>
-          <w:ilvl w:val="0"/>
-          <w:numId w:val="1018"/>
+        <w:t xml:space="preserve">— ім’я, email, роль, тип автентифікації (тільки для перегляду).</w:t>
+      </w:r>
+    </w:p>
+    <w:p>
+      <w:pPr>
+        <w:numPr>
+          <w:ilvl w:val="0"/>
+          <w:numId w:val="1009"/>
         </w:numPr>
         <w:pStyle w:val="Compact"/>
       </w:pPr>
@@ -3541,6 +3469,273 @@
       </w:pPr>
       <w:r>
         <w:t xml:space="preserve">Якщо ваш обліковий запис автентифікується через Active Directory — блоку зміни пароля не буде: пароль для таких облікових записів керується самим AD (змінюйте його в Windows, як зазвичай), а не тут.</w:t>
+      </w:r>
+    </w:p>
+    <w:bookmarkStart w:id="43" w:name="Xd3547e8f2b045db79a7bffed1b32dc045dd5781"/>
+    <w:p>
+      <w:pPr>
+        <w:pStyle w:val="Heading3"/>
+      </w:pPr>
+      <w:r>
+        <w:t xml:space="preserve">Токени доступу до API (для тих, хто пише скрипти й інтеграції)</w:t>
+      </w:r>
+    </w:p>
+    <w:p>
+      <w:pPr>
+        <w:pStyle w:val="FirstParagraph"/>
+      </w:pPr>
+      <w:r>
+        <w:t xml:space="preserve">Звичайним користувачам цей блок не потрібен. Він з’являється, лише коли адміністратор</w:t>
+      </w:r>
+      <w:r>
+        <w:t xml:space="preserve"> </w:t>
+      </w:r>
+      <w:r>
+        <w:rPr>
+          <w:bCs/>
+          <w:b/>
+        </w:rPr>
+        <w:t xml:space="preserve">увімкнув REST API</w:t>
+      </w:r>
+      <w:r>
+        <w:t xml:space="preserve">, і дозволяє програмі чи скрипту працювати в системі</w:t>
+      </w:r>
+      <w:r>
+        <w:t xml:space="preserve"> </w:t>
+      </w:r>
+      <w:r>
+        <w:rPr>
+          <w:bCs/>
+          <w:b/>
+        </w:rPr>
+        <w:t xml:space="preserve">від вашого імені</w:t>
+      </w:r>
+      <w:r>
+        <w:t xml:space="preserve"> </w:t>
+      </w:r>
+      <w:r>
+        <w:t xml:space="preserve">— наприклад, автоматично створювати тікети чи читати список ваших задач. Документація для розробників —</w:t>
+      </w:r>
+      <w:r>
+        <w:t xml:space="preserve"> </w:t>
+      </w:r>
+      <w:r>
+        <w:rPr>
+          <w:rStyle w:val="VerbatimChar"/>
+        </w:rPr>
+        <w:t xml:space="preserve">docs/API_GUIDE.md</w:t>
+      </w:r>
+      <w:r>
+        <w:t xml:space="preserve">.</w:t>
+      </w:r>
+    </w:p>
+    <w:p>
+      <w:pPr>
+        <w:numPr>
+          <w:ilvl w:val="0"/>
+          <w:numId w:val="1010"/>
+        </w:numPr>
+        <w:pStyle w:val="Compact"/>
+      </w:pPr>
+      <w:r>
+        <w:t xml:space="preserve">У блоці «Токени доступу до API» вкажіть</w:t>
+      </w:r>
+      <w:r>
+        <w:t xml:space="preserve"> </w:t>
+      </w:r>
+      <w:r>
+        <w:rPr>
+          <w:bCs/>
+          <w:b/>
+        </w:rPr>
+        <w:t xml:space="preserve">назву</w:t>
+      </w:r>
+      <w:r>
+        <w:t xml:space="preserve"> </w:t>
+      </w:r>
+      <w:r>
+        <w:t xml:space="preserve">(щоб потім упізнати токен, наприклад «Мій скрипт»),</w:t>
+      </w:r>
+      <w:r>
+        <w:t xml:space="preserve"> </w:t>
+      </w:r>
+      <w:r>
+        <w:rPr>
+          <w:bCs/>
+          <w:b/>
+        </w:rPr>
+        <w:t xml:space="preserve">права</w:t>
+      </w:r>
+      <w:r>
+        <w:t xml:space="preserve"> </w:t>
+      </w:r>
+      <w:r>
+        <w:t xml:space="preserve">— «Лише читання» або «Читання й запис» (обирайте мінімально потрібні) і</w:t>
+      </w:r>
+      <w:r>
+        <w:t xml:space="preserve"> </w:t>
+      </w:r>
+      <w:r>
+        <w:rPr>
+          <w:bCs/>
+          <w:b/>
+        </w:rPr>
+        <w:t xml:space="preserve">термін дії</w:t>
+      </w:r>
+      <w:r>
+        <w:t xml:space="preserve"> </w:t>
+      </w:r>
+      <w:r>
+        <w:t xml:space="preserve">(30 днів, 90 днів, 1 рік чи без обмеження). Натисніть</w:t>
+      </w:r>
+      <w:r>
+        <w:t xml:space="preserve"> </w:t>
+      </w:r>
+      <w:r>
+        <w:rPr>
+          <w:bCs/>
+          <w:b/>
+        </w:rPr>
+        <w:t xml:space="preserve">«Створити»</w:t>
+      </w:r>
+      <w:r>
+        <w:t xml:space="preserve">.</w:t>
+      </w:r>
+    </w:p>
+    <w:p>
+      <w:pPr>
+        <w:numPr>
+          <w:ilvl w:val="0"/>
+          <w:numId w:val="1010"/>
+        </w:numPr>
+        <w:pStyle w:val="Compact"/>
+      </w:pPr>
+      <w:r>
+        <w:t xml:space="preserve">Система покаже</w:t>
+      </w:r>
+      <w:r>
+        <w:t xml:space="preserve"> </w:t>
+      </w:r>
+      <w:r>
+        <w:rPr>
+          <w:bCs/>
+          <w:b/>
+        </w:rPr>
+        <w:t xml:space="preserve">повний токен</w:t>
+      </w:r>
+      <w:r>
+        <w:t xml:space="preserve"> </w:t>
+      </w:r>
+      <w:r>
+        <w:t xml:space="preserve">(</w:t>
+      </w:r>
+      <w:r>
+        <w:rPr>
+          <w:rStyle w:val="VerbatimChar"/>
+        </w:rPr>
+        <w:t xml:space="preserve">itsm_…</w:t>
+      </w:r>
+      <w:r>
+        <w:t xml:space="preserve">) у зеленому блоці —</w:t>
+      </w:r>
+      <w:r>
+        <w:t xml:space="preserve"> </w:t>
+      </w:r>
+      <w:r>
+        <w:rPr>
+          <w:bCs/>
+          <w:b/>
+        </w:rPr>
+        <w:t xml:space="preserve">один раз</w:t>
+      </w:r>
+      <w:r>
+        <w:t xml:space="preserve">. Скопіюйте його одразу й збережіть у надійному місці: після оновлення сторінки видно лише початок токена, а відновити його неможливо — доведеться створити новий.</w:t>
+      </w:r>
+    </w:p>
+    <w:p>
+      <w:pPr>
+        <w:numPr>
+          <w:ilvl w:val="0"/>
+          <w:numId w:val="1010"/>
+        </w:numPr>
+        <w:pStyle w:val="Compact"/>
+      </w:pPr>
+      <w:r>
+        <w:t xml:space="preserve">У таблиці нижче видно ваші токени: назву, початок, права, коли токен використовувався востаннє й до якої дати діє. Кнопка</w:t>
+      </w:r>
+      <w:r>
+        <w:t xml:space="preserve"> </w:t>
+      </w:r>
+      <w:r>
+        <w:rPr>
+          <w:bCs/>
+          <w:b/>
+        </w:rPr>
+        <w:t xml:space="preserve">«Відкликати»</w:t>
+      </w:r>
+      <w:r>
+        <w:t xml:space="preserve"> </w:t>
+      </w:r>
+      <w:r>
+        <w:t xml:space="preserve">(з підтвердженням) вимикає токен назавжди — програма, що ним користується, одразу перестає працювати.</w:t>
+      </w:r>
+    </w:p>
+    <w:p>
+      <w:pPr>
+        <w:pStyle w:val="FirstParagraph"/>
+      </w:pPr>
+      <w:r>
+        <w:t xml:space="preserve">Важливо знати:</w:t>
+      </w:r>
+      <w:r>
+        <w:t xml:space="preserve"> </w:t>
+      </w:r>
+      <w:r>
+        <w:t xml:space="preserve">- Токен</w:t>
+      </w:r>
+      <w:r>
+        <w:t xml:space="preserve"> </w:t>
+      </w:r>
+      <w:r>
+        <w:rPr>
+          <w:bCs/>
+          <w:b/>
+        </w:rPr>
+        <w:t xml:space="preserve">має ті самі права, що й ви</w:t>
+      </w:r>
+      <w:r>
+        <w:t xml:space="preserve">: бачить ті самі проєкти, задачі й тікети й діє від вашого імені — усі дії записуються в журнал як ваші (з позначкою, що вони виконані через API). Тому поводьтесь із ним, як із паролем:</w:t>
+      </w:r>
+      <w:r>
+        <w:t xml:space="preserve"> </w:t>
+      </w:r>
+      <w:r>
+        <w:rPr>
+          <w:bCs/>
+          <w:b/>
+        </w:rPr>
+        <w:t xml:space="preserve">нікому не передавайте, не публікуйте в репозиторіях і чатах</w:t>
+      </w:r>
+      <w:r>
+        <w:t xml:space="preserve">. Якщо токен міг потрапити до сторонніх — одразу відкличте його й створіть новий.</w:t>
+      </w:r>
+      <w:r>
+        <w:t xml:space="preserve"> </w:t>
+      </w:r>
+      <w:r>
+        <w:t xml:space="preserve">- Одночасно може діяти не більше 20 токенів. Прострочені й відкликані токени не враховуються.</w:t>
+      </w:r>
+      <w:r>
+        <w:t xml:space="preserve"> </w:t>
+      </w:r>
+      <w:r>
+        <w:t xml:space="preserve">- Для автоматизації, яка не повинна діяти від імені конкретної людини (наприклад, моніторинг), попросіть адміністратора створити окремий службовий обліковий запис і видати токен йому.</w:t>
+      </w:r>
+      <w:r>
+        <w:t xml:space="preserve"> </w:t>
+      </w:r>
+      <w:r>
+        <w:t xml:space="preserve">- Токен перестає діяти, якщо вимкнути REST API чи деактивувати ваш обліковий запис.</w:t>
       </w:r>
     </w:p>
     <w:p>
@@ -3551,7 +3746,8 @@
       </w:r>
     </w:p>
     <w:bookmarkEnd w:id="43"/>
-    <w:bookmarkStart w:id="44" w:name="Xd450aed09f98598169258fa29caca8ed084ee67"/>
+    <w:bookmarkEnd w:id="44"/>
+    <w:bookmarkStart w:id="45" w:name="архів"/>
     <w:p>
       <w:pPr>
         <w:pStyle w:val="Heading2"/>
@@ -3620,8 +3816,8 @@
         </w:pict>
       </w:r>
     </w:p>
-    <w:bookmarkEnd w:id="44"/>
-    <w:bookmarkStart w:id="45" w:name="X610c11f445103ecdb2407a89154d1647186f56a"/>
+    <w:bookmarkEnd w:id="45"/>
+    <w:bookmarkStart w:id="46" w:name="вікі"/>
     <w:p>
       <w:pPr>
         <w:pStyle w:val="Heading2"/>
@@ -3658,7 +3854,7 @@
       <w:pPr>
         <w:numPr>
           <w:ilvl w:val="0"/>
-          <w:numId w:val="1019"/>
+          <w:numId w:val="1011"/>
         </w:numPr>
         <w:pStyle w:val="Compact"/>
       </w:pPr>
@@ -3680,7 +3876,7 @@
       <w:pPr>
         <w:numPr>
           <w:ilvl w:val="0"/>
-          <w:numId w:val="1019"/>
+          <w:numId w:val="1011"/>
         </w:numPr>
         <w:pStyle w:val="Compact"/>
       </w:pPr>
@@ -3702,7 +3898,7 @@
       <w:pPr>
         <w:numPr>
           <w:ilvl w:val="0"/>
-          <w:numId w:val="1019"/>
+          <w:numId w:val="1011"/>
         </w:numPr>
         <w:pStyle w:val="Compact"/>
       </w:pPr>
@@ -3724,7 +3920,7 @@
       <w:pPr>
         <w:numPr>
           <w:ilvl w:val="0"/>
-          <w:numId w:val="1019"/>
+          <w:numId w:val="1011"/>
         </w:numPr>
         <w:pStyle w:val="Compact"/>
       </w:pPr>
@@ -3744,6 +3940,50 @@
     </w:p>
     <w:p>
       <w:pPr>
+        <w:numPr>
+          <w:ilvl w:val="0"/>
+          <w:numId w:val="1011"/>
+        </w:numPr>
+        <w:pStyle w:val="Compact"/>
+      </w:pPr>
+      <w:r>
+        <w:rPr>
+          <w:bCs/>
+          <w:b/>
+        </w:rPr>
+        <w:t xml:space="preserve">Вкладені сторінки (ієрархія)</w:t>
+      </w:r>
+      <w:r>
+        <w:t xml:space="preserve"> </w:t>
+      </w:r>
+      <w:r>
+        <w:t xml:space="preserve">— сторінки можуть бути «підсторінками» інших: у меню ліворуч вони показані з відступом під своєю батьківською сторінкою, угорі сторінки є шлях («Вікі / Інфраструктура / Мережа»), а внизу — список її підсторінок. Якщо батьківська сторінка призначена не для вашої ролі, вона у вашому шляху не показується, а підсторінка стоїть у меню на верхньому рівні.</w:t>
+      </w:r>
+    </w:p>
+    <w:p>
+      <w:pPr>
+        <w:numPr>
+          <w:ilvl w:val="0"/>
+          <w:numId w:val="1011"/>
+        </w:numPr>
+        <w:pStyle w:val="Compact"/>
+      </w:pPr>
+      <w:r>
+        <w:rPr>
+          <w:bCs/>
+          <w:b/>
+        </w:rPr>
+        <w:t xml:space="preserve">Зображення й файли на сторінці</w:t>
+      </w:r>
+      <w:r>
+        <w:t xml:space="preserve"> </w:t>
+      </w:r>
+      <w:r>
+        <w:t xml:space="preserve">— у тексті можуть бути картинки (клік по картинці відкриває її в повному розмірі), а внизу сторінки — блок «Вкладення» з файлами, які можна відкрити чи завантажити. Файли бачать ті, хто бачить саму сторінку.</w:t>
+      </w:r>
+    </w:p>
+    <w:p>
+      <w:pPr>
         <w:pStyle w:val="FirstParagraph"/>
       </w:pPr>
       <w:r>
@@ -3757,7 +3997,7 @@
         <w:t xml:space="preserve"> </w:t>
       </w:r>
       <w:r>
-        <w:t xml:space="preserve">— для всіх інших вікі працює на читання. Якщо ви помітили помилку чи застарілий пункт, повідомте одного з них. Якщо ви один із них, див. розділ 14 гайда адміністратора (розмітка, версії, видимість сторінок).</w:t>
+        <w:t xml:space="preserve">— для всіх інших вікі працює на читання. Якщо ви помітили помилку чи застарілий пункт, повідомте одного з них. Якщо ви один із них, див. розділ 14 гайда адміністратора (розмітка, версії, видимість сторінок, підсторінки, зображення й вкладення).</w:t>
       </w:r>
     </w:p>
     <w:p>
@@ -3767,62 +4007,14 @@
         </w:pict>
       </w:r>
     </w:p>
-    <w:bookmarkEnd w:id="45"/>
-    <w:bookmarkStart w:id="46" w:name="X5cd786e3c0f6ab0ef45d4430829a6afe9f94f05"/>
+    <w:bookmarkEnd w:id="46"/>
+    <w:bookmarkStart w:id="47" w:name="документи-бібліотека-файлів"/>
     <w:p>
       <w:pPr>
         <w:pStyle w:val="Heading2"/>
       </w:pPr>
       <w:r>
-        <w:t xml:space="preserve">11. Чого в системі поки немає</w:t>
-      </w:r>
-    </w:p>
-    <w:p>
-      <w:pPr>
-        <w:numPr>
-          <w:ilvl w:val="0"/>
-          <w:numId w:val="1020"/>
-        </w:numPr>
-        <w:pStyle w:val="Compact"/>
-      </w:pPr>
-      <w:r>
-        <w:t xml:space="preserve">Форуми й окрема бібліотека файлових документів. Вкладення прикріплюються лише до тікетів і задач (не до коментарів, проєктів чи сторінок вікі); у сторінки вікі зображення вставити поки не можна.</w:t>
-      </w:r>
-    </w:p>
-    <w:p>
-      <w:pPr>
-        <w:numPr>
-          <w:ilvl w:val="0"/>
-          <w:numId w:val="1020"/>
-        </w:numPr>
-        <w:pStyle w:val="Compact"/>
-      </w:pPr>
-      <w:r>
-        <w:t xml:space="preserve">Перегляд власних файлів на сторінці відстеження порталу (без входу в систему) — їх бачать лише оператори.</w:t>
-      </w:r>
-    </w:p>
-    <w:p>
-      <w:pPr>
-        <w:numPr>
-          <w:ilvl w:val="0"/>
-          <w:numId w:val="1020"/>
-        </w:numPr>
-        <w:pStyle w:val="Compact"/>
-      </w:pPr>
-      <w:r>
-        <w:t xml:space="preserve">Кнопка «Вийти з проєкту»: доступ учасника скасовує автор, відповідальний чи адміністратор.</w:t>
-      </w:r>
-    </w:p>
-    <w:p>
-      <w:pPr>
-        <w:numPr>
-          <w:ilvl w:val="0"/>
-          <w:numId w:val="1020"/>
-        </w:numPr>
-        <w:pStyle w:val="Compact"/>
-      </w:pPr>
-      <w:r>
-        <w:t xml:space="preserve">Вхід без введення пароля (автоматично під обліковим записом Windows) для користувачів Active Directory — поки лише форма з email і доменним паролем.</w:t>
+        <w:t xml:space="preserve">11. Документи (бібліотека файлів)</w:t>
       </w:r>
     </w:p>
     <w:p>
@@ -3830,22 +4022,156 @@
         <w:pStyle w:val="FirstParagraph"/>
       </w:pPr>
       <w:r>
-        <w:t xml:space="preserve">Якщо у вас є пропозиції чи ви очікували побачити функціонал, якого немає, — повідомте адміністратора системи: перелік того, що заплановано, є в</w:t>
-      </w:r>
-      <w:r>
-        <w:t xml:space="preserve"> </w:t>
-      </w:r>
-      <w:r>
-        <w:rPr>
-          <w:rStyle w:val="VerbatimChar"/>
-        </w:rPr>
-        <w:t xml:space="preserve">docs/ADMIN_GUIDE.md</w:t>
-      </w:r>
-      <w:r>
-        <w:t xml:space="preserve"> </w:t>
-      </w:r>
-      <w:r>
-        <w:t xml:space="preserve">(розділ 15).</w:t>
+        <w:t xml:space="preserve">Пункт меню</w:t>
+      </w:r>
+      <w:r>
+        <w:t xml:space="preserve"> </w:t>
+      </w:r>
+      <w:r>
+        <w:rPr>
+          <w:bCs/>
+          <w:b/>
+        </w:rPr>
+        <w:t xml:space="preserve">«Документи»</w:t>
+      </w:r>
+      <w:r>
+        <w:t xml:space="preserve"> </w:t>
+      </w:r>
+      <w:r>
+        <w:t xml:space="preserve">— спільна бібліотека файлів, не прив’язаних до тікета чи задачі: регламенти, інструкції, форми, шаблони.</w:t>
+      </w:r>
+    </w:p>
+    <w:p>
+      <w:pPr>
+        <w:numPr>
+          <w:ilvl w:val="0"/>
+          <w:numId w:val="1012"/>
+        </w:numPr>
+        <w:pStyle w:val="Compact"/>
+      </w:pPr>
+      <w:r>
+        <w:rPr>
+          <w:bCs/>
+          <w:b/>
+        </w:rPr>
+        <w:t xml:space="preserve">Розділи</w:t>
+      </w:r>
+      <w:r>
+        <w:t xml:space="preserve"> </w:t>
+      </w:r>
+      <w:r>
+        <w:t xml:space="preserve">— ліворуч; біля кожного — кількість документів. Рядок</w:t>
+      </w:r>
+      <w:r>
+        <w:t xml:space="preserve"> </w:t>
+      </w:r>
+      <w:r>
+        <w:rPr>
+          <w:bCs/>
+          <w:b/>
+        </w:rPr>
+        <w:t xml:space="preserve">«Пошук документів»</w:t>
+      </w:r>
+      <w:r>
+        <w:t xml:space="preserve"> </w:t>
+      </w:r>
+      <w:r>
+        <w:t xml:space="preserve">шукає за назвою й описом (регістр не важливий) і працює в межах обраного розділу.</w:t>
+      </w:r>
+    </w:p>
+    <w:p>
+      <w:pPr>
+        <w:numPr>
+          <w:ilvl w:val="0"/>
+          <w:numId w:val="1012"/>
+        </w:numPr>
+        <w:pStyle w:val="Compact"/>
+      </w:pPr>
+      <w:r>
+        <w:rPr>
+          <w:bCs/>
+          <w:b/>
+        </w:rPr>
+        <w:t xml:space="preserve">Документ</w:t>
+      </w:r>
+      <w:r>
+        <w:t xml:space="preserve"> </w:t>
+      </w:r>
+      <w:r>
+        <w:t xml:space="preserve">— це назва, опис і один чи кілька файлів-</w:t>
+      </w:r>
+      <w:r>
+        <w:rPr>
+          <w:bCs/>
+          <w:b/>
+        </w:rPr>
+        <w:t xml:space="preserve">версій</w:t>
+      </w:r>
+      <w:r>
+        <w:t xml:space="preserve">. Кнопка завантаження на сторінці документа віддає</w:t>
+      </w:r>
+      <w:r>
+        <w:t xml:space="preserve"> </w:t>
+      </w:r>
+      <w:r>
+        <w:rPr>
+          <w:bCs/>
+          <w:b/>
+        </w:rPr>
+        <w:t xml:space="preserve">найновішу</w:t>
+      </w:r>
+      <w:r>
+        <w:t xml:space="preserve"> </w:t>
+      </w:r>
+      <w:r>
+        <w:t xml:space="preserve">версію; на сторінці документа видно всі версії (хто й коли додав, розмір) і кожну можна завантажити окремо — наприклад, попередню редакцію регламенту.</w:t>
+      </w:r>
+    </w:p>
+    <w:p>
+      <w:pPr>
+        <w:numPr>
+          <w:ilvl w:val="0"/>
+          <w:numId w:val="1012"/>
+        </w:numPr>
+        <w:pStyle w:val="Compact"/>
+      </w:pPr>
+      <w:r>
+        <w:t xml:space="preserve">PDF і зображення (JPG, PNG) браузер відкриває прямо у вкладці; решту файлів (документи Office, OpenDocument, TXT, CSV) завантажує на диск.</w:t>
+      </w:r>
+    </w:p>
+    <w:p>
+      <w:pPr>
+        <w:numPr>
+          <w:ilvl w:val="0"/>
+          <w:numId w:val="1012"/>
+        </w:numPr>
+        <w:pStyle w:val="Compact"/>
+      </w:pPr>
+      <w:r>
+        <w:t xml:space="preserve">Бачите ви лише ті документи, що призначені для вашої ролі. Якщо колега посилається на документ, якого у вас немає, — він не для вашої ролі (система відповідає «не знайдено»).</w:t>
+      </w:r>
+    </w:p>
+    <w:p>
+      <w:pPr>
+        <w:pStyle w:val="FirstParagraph"/>
+      </w:pPr>
+      <w:r>
+        <w:rPr>
+          <w:bCs/>
+          <w:b/>
+        </w:rPr>
+        <w:t xml:space="preserve">Додавати документи, нові версії й розділи можуть лише адміністратор системи та керівник ІТ-підрозділу</w:t>
+      </w:r>
+      <w:r>
+        <w:t xml:space="preserve">; для решти бібліотека працює на читання. Видалити документ чи версію може адміністратор або той редактор, що створив документ. Якщо ви один із них, див. розділ 20 гайда адміністратора.</w:t>
+      </w:r>
+    </w:p>
+    <w:p>
+      <w:pPr>
+        <w:pStyle w:val="BodyText"/>
+      </w:pPr>
+      <w:r>
+        <w:t xml:space="preserve">Дозволені формати: PDF, JPG, PNG, DOCX, XLSX, PPTX, ODT, ODS, ODP, TXT, CSV (файли з макросами, архіви, виконувані файли та HTML не приймаються).</w:t>
       </w:r>
     </w:p>
     <w:p>
@@ -3855,14 +4181,14 @@
         </w:pict>
       </w:r>
     </w:p>
-    <w:bookmarkEnd w:id="46"/>
-    <w:bookmarkStart w:id="47" w:name="X08ec01698902ac6f13da53e33deacb23b832ea8"/>
+    <w:bookmarkEnd w:id="47"/>
+    <w:bookmarkStart w:id="48" w:name="форум"/>
     <w:p>
       <w:pPr>
         <w:pStyle w:val="Heading2"/>
       </w:pPr>
       <w:r>
-        <w:t xml:space="preserve">12. Якщо сторінка показала помилку</w:t>
+        <w:t xml:space="preserve">12. Форум</w:t>
       </w:r>
     </w:p>
     <w:p>
@@ -3870,7 +4196,414 @@
         <w:pStyle w:val="FirstParagraph"/>
       </w:pPr>
       <w:r>
-        <w:t xml:space="preserve">Якщо замість сторінки з'явилося повідомлення</w:t>
+        <w:t xml:space="preserve">Пункт меню</w:t>
+      </w:r>
+      <w:r>
+        <w:t xml:space="preserve"> </w:t>
+      </w:r>
+      <w:r>
+        <w:rPr>
+          <w:bCs/>
+          <w:b/>
+        </w:rPr>
+        <w:t xml:space="preserve">«Форум»</w:t>
+      </w:r>
+      <w:r>
+        <w:t xml:space="preserve"> </w:t>
+      </w:r>
+      <w:r>
+        <w:t xml:space="preserve">— обговорення між співробітниками: питання, поради, оголошення. Форум складається з</w:t>
+      </w:r>
+      <w:r>
+        <w:t xml:space="preserve"> </w:t>
+      </w:r>
+      <w:r>
+        <w:rPr>
+          <w:bCs/>
+          <w:b/>
+        </w:rPr>
+        <w:t xml:space="preserve">розділів</w:t>
+      </w:r>
+      <w:r>
+        <w:t xml:space="preserve">, у розділах —</w:t>
+      </w:r>
+      <w:r>
+        <w:t xml:space="preserve"> </w:t>
+      </w:r>
+      <w:r>
+        <w:rPr>
+          <w:bCs/>
+          <w:b/>
+        </w:rPr>
+        <w:t xml:space="preserve">теми</w:t>
+      </w:r>
+      <w:r>
+        <w:t xml:space="preserve">, у темах —</w:t>
+      </w:r>
+      <w:r>
+        <w:t xml:space="preserve"> </w:t>
+      </w:r>
+      <w:r>
+        <w:rPr>
+          <w:bCs/>
+          <w:b/>
+        </w:rPr>
+        <w:t xml:space="preserve">повідомлення</w:t>
+      </w:r>
+      <w:r>
+        <w:t xml:space="preserve">.</w:t>
+      </w:r>
+    </w:p>
+    <w:p>
+      <w:pPr>
+        <w:numPr>
+          <w:ilvl w:val="0"/>
+          <w:numId w:val="1013"/>
+        </w:numPr>
+        <w:pStyle w:val="Compact"/>
+      </w:pPr>
+      <w:r>
+        <w:rPr>
+          <w:bCs/>
+          <w:b/>
+        </w:rPr>
+        <w:t xml:space="preserve">Читати</w:t>
+      </w:r>
+      <w:r>
+        <w:t xml:space="preserve"> </w:t>
+      </w:r>
+      <w:r>
+        <w:t xml:space="preserve">можуть усі, хто бачить розділ (кожен розділ призначений для певних ролей — як і сторінки вікі). Розділ чи тему, не призначені для вашої ролі, система показує як неіснуючі.</w:t>
+      </w:r>
+    </w:p>
+    <w:p>
+      <w:pPr>
+        <w:numPr>
+          <w:ilvl w:val="0"/>
+          <w:numId w:val="1013"/>
+        </w:numPr>
+        <w:pStyle w:val="Compact"/>
+      </w:pPr>
+      <w:r>
+        <w:rPr>
+          <w:bCs/>
+          <w:b/>
+        </w:rPr>
+        <w:t xml:space="preserve">Нова тема</w:t>
+      </w:r>
+      <w:r>
+        <w:t xml:space="preserve"> </w:t>
+      </w:r>
+      <w:r>
+        <w:t xml:space="preserve">— кнопка в розділі: заголовок і текст.</w:t>
+      </w:r>
+      <w:r>
+        <w:t xml:space="preserve"> </w:t>
+      </w:r>
+      <w:r>
+        <w:rPr>
+          <w:bCs/>
+          <w:b/>
+        </w:rPr>
+        <w:t xml:space="preserve">Відповідь</w:t>
+      </w:r>
+      <w:r>
+        <w:t xml:space="preserve"> </w:t>
+      </w:r>
+      <w:r>
+        <w:t xml:space="preserve">— форма внизу теми. Текст пишеться в Markdown (</w:t>
+      </w:r>
+      <w:r>
+        <w:rPr>
+          <w:bCs/>
+          <w:b/>
+        </w:rPr>
+        <w:t xml:space="preserve">жирний</w:t>
+      </w:r>
+      <w:r>
+        <w:t xml:space="preserve">,</w:t>
+      </w:r>
+      <w:r>
+        <w:t xml:space="preserve"> </w:t>
+      </w:r>
+      <w:r>
+        <w:rPr>
+          <w:iCs/>
+          <w:i/>
+        </w:rPr>
+        <w:t xml:space="preserve">курсив</w:t>
+      </w:r>
+      <w:r>
+        <w:t xml:space="preserve">,</w:t>
+      </w:r>
+      <w:r>
+        <w:t xml:space="preserve"> </w:t>
+      </w:r>
+      <w:r>
+        <w:rPr>
+          <w:rStyle w:val="VerbatimChar"/>
+        </w:rPr>
+        <w:t xml:space="preserve">код</w:t>
+      </w:r>
+      <w:r>
+        <w:t xml:space="preserve">, списки, &gt; цитата, посилання; картинок і сирого HTML немає — як у вікі).</w:t>
+      </w:r>
+    </w:p>
+    <w:p>
+      <w:pPr>
+        <w:numPr>
+          <w:ilvl w:val="0"/>
+          <w:numId w:val="1013"/>
+        </w:numPr>
+        <w:pStyle w:val="Compact"/>
+      </w:pPr>
+      <w:r>
+        <w:rPr>
+          <w:bCs/>
+          <w:b/>
+        </w:rPr>
+        <w:t xml:space="preserve">Редагувати й видаляти свої повідомлення</w:t>
+      </w:r>
+      <w:r>
+        <w:t xml:space="preserve"> </w:t>
+      </w:r>
+      <w:r>
+        <w:t xml:space="preserve">можна, поки тему не закрито. Якщо видалити перше повідомлення, видаляється вся тема з відповідями (система спитає підтвердження). Біля змінених повідомлень стоїть позначка «змінено».</w:t>
+      </w:r>
+    </w:p>
+    <w:p>
+      <w:pPr>
+        <w:numPr>
+          <w:ilvl w:val="0"/>
+          <w:numId w:val="1013"/>
+        </w:numPr>
+        <w:pStyle w:val="Compact"/>
+      </w:pPr>
+      <w:r>
+        <w:rPr>
+          <w:bCs/>
+          <w:b/>
+        </w:rPr>
+        <w:t xml:space="preserve">Закріплені теми</w:t>
+      </w:r>
+      <w:r>
+        <w:t xml:space="preserve"> </w:t>
+      </w:r>
+      <w:r>
+        <w:t xml:space="preserve">(📌) стоять угорі розділу,</w:t>
+      </w:r>
+      <w:r>
+        <w:t xml:space="preserve"> </w:t>
+      </w:r>
+      <w:r>
+        <w:rPr>
+          <w:bCs/>
+          <w:b/>
+        </w:rPr>
+        <w:t xml:space="preserve">закриті</w:t>
+      </w:r>
+      <w:r>
+        <w:t xml:space="preserve"> </w:t>
+      </w:r>
+      <w:r>
+        <w:t xml:space="preserve">(🔒) — читаються, але відповісти в них не можна.</w:t>
+      </w:r>
+    </w:p>
+    <w:p>
+      <w:pPr>
+        <w:numPr>
+          <w:ilvl w:val="0"/>
+          <w:numId w:val="1013"/>
+        </w:numPr>
+        <w:pStyle w:val="Compact"/>
+      </w:pPr>
+      <w:r>
+        <w:rPr>
+          <w:bCs/>
+          <w:b/>
+        </w:rPr>
+        <w:t xml:space="preserve">Пошук на форумі</w:t>
+      </w:r>
+      <w:r>
+        <w:t xml:space="preserve"> </w:t>
+      </w:r>
+      <w:r>
+        <w:t xml:space="preserve">— рядок угорі; шукає за заголовками й текстом лише в тих розділах, що вам доступні.</w:t>
+      </w:r>
+    </w:p>
+    <w:p>
+      <w:pPr>
+        <w:numPr>
+          <w:ilvl w:val="0"/>
+          <w:numId w:val="1013"/>
+        </w:numPr>
+        <w:pStyle w:val="Compact"/>
+      </w:pPr>
+      <w:r>
+        <w:rPr>
+          <w:bCs/>
+          <w:b/>
+        </w:rPr>
+        <w:t xml:space="preserve">Обмеження частоти:</w:t>
+      </w:r>
+      <w:r>
+        <w:t xml:space="preserve"> </w:t>
+      </w:r>
+      <w:r>
+        <w:t xml:space="preserve">щоб форум не засмічували, можна надсилати не більше 10 тем і відповідей за 5 хвилин (і 100 за добу). Якщо ліміт вичерпано, система напише, через скільки спробувати знову; текст у формі лишається.</w:t>
+      </w:r>
+    </w:p>
+    <w:p>
+      <w:pPr>
+        <w:numPr>
+          <w:ilvl w:val="0"/>
+          <w:numId w:val="1013"/>
+        </w:numPr>
+        <w:pStyle w:val="Compact"/>
+      </w:pPr>
+      <w:r>
+        <w:rPr>
+          <w:bCs/>
+          <w:b/>
+        </w:rPr>
+        <w:t xml:space="preserve">Email-сповіщення.</w:t>
+      </w:r>
+      <w:r>
+        <w:t xml:space="preserve"> </w:t>
+      </w:r>
+      <w:r>
+        <w:t xml:space="preserve">Якщо адміністратор увімкнув сповіщення про форум, ви отримаєте лист, коли хтось відповість у темі, яку ви створили або в якій писали (себе ви не сповіщаєте).</w:t>
+      </w:r>
+    </w:p>
+    <w:p>
+      <w:pPr>
+        <w:pStyle w:val="FirstParagraph"/>
+      </w:pPr>
+      <w:r>
+        <w:rPr>
+          <w:bCs/>
+          <w:b/>
+        </w:rPr>
+        <w:t xml:space="preserve">Модерація</w:t>
+      </w:r>
+      <w:r>
+        <w:t xml:space="preserve"> </w:t>
+      </w:r>
+      <w:r>
+        <w:t xml:space="preserve">(адміністратор і керівник ІТ-підрозділу): створення, зміна й видалення розділів, закріплення, закриття, перенесення в інший розділ, видалення будь-яких тем і повідомлень. Деталі — розділ 21 гайда адміністратора.</w:t>
+      </w:r>
+    </w:p>
+    <w:p>
+      <w:r>
+        <w:pict>
+          <v:rect style="width:0;height:1.5pt" o:hralign="center" o:hrstd="t" o:hr="t"/>
+        </w:pict>
+      </w:r>
+    </w:p>
+    <w:bookmarkEnd w:id="48"/>
+    <w:bookmarkStart w:id="49" w:name="чого-в-системі-поки-немає"/>
+    <w:p>
+      <w:pPr>
+        <w:pStyle w:val="Heading2"/>
+      </w:pPr>
+      <w:r>
+        <w:t xml:space="preserve">13. Чого в системі поки немає</w:t>
+      </w:r>
+    </w:p>
+    <w:p>
+      <w:pPr>
+        <w:numPr>
+          <w:ilvl w:val="0"/>
+          <w:numId w:val="1014"/>
+        </w:numPr>
+        <w:pStyle w:val="Compact"/>
+      </w:pPr>
+      <w:r>
+        <w:t xml:space="preserve">Вкладення до коментарів і проєктів: файли прикріплюються до тікетів і задач (розділи 4.9 і 7.5), до сторінок вікі (розділ 10) та як окремі документи в бібліотеці (розділ 11). Вкладень у повідомленнях форуму немає.</w:t>
+      </w:r>
+    </w:p>
+    <w:p>
+      <w:pPr>
+        <w:numPr>
+          <w:ilvl w:val="0"/>
+          <w:numId w:val="1014"/>
+        </w:numPr>
+        <w:pStyle w:val="Compact"/>
+      </w:pPr>
+      <w:r>
+        <w:t xml:space="preserve">Перегляд власних файлів на сторінці відстеження порталу (без входу в систему) — їх бачать лише оператори.</w:t>
+      </w:r>
+    </w:p>
+    <w:p>
+      <w:pPr>
+        <w:numPr>
+          <w:ilvl w:val="0"/>
+          <w:numId w:val="1014"/>
+        </w:numPr>
+        <w:pStyle w:val="Compact"/>
+      </w:pPr>
+      <w:r>
+        <w:t xml:space="preserve">Кнопка «Вийти з проєкту»: доступ учасника скасовує автор, відповідальний чи адміністратор.</w:t>
+      </w:r>
+    </w:p>
+    <w:p>
+      <w:pPr>
+        <w:numPr>
+          <w:ilvl w:val="0"/>
+          <w:numId w:val="1014"/>
+        </w:numPr>
+        <w:pStyle w:val="Compact"/>
+      </w:pPr>
+      <w:r>
+        <w:t xml:space="preserve">Вхід без введення пароля (автоматично під обліковим записом Windows) для користувачів Active Directory — поки лише форма з email і доменним паролем.</w:t>
+      </w:r>
+    </w:p>
+    <w:p>
+      <w:pPr>
+        <w:pStyle w:val="FirstParagraph"/>
+      </w:pPr>
+      <w:r>
+        <w:t xml:space="preserve">Якщо у вас є пропозиції чи ви очікували побачити функціонал, якого немає, — повідомте адміністратора системи: перелік того, що заплановано, є в</w:t>
+      </w:r>
+      <w:r>
+        <w:t xml:space="preserve"> </w:t>
+      </w:r>
+      <w:r>
+        <w:rPr>
+          <w:rStyle w:val="VerbatimChar"/>
+        </w:rPr>
+        <w:t xml:space="preserve">docs/ADMIN_GUIDE.md</w:t>
+      </w:r>
+      <w:r>
+        <w:t xml:space="preserve"> </w:t>
+      </w:r>
+      <w:r>
+        <w:t xml:space="preserve">(розділ 15).</w:t>
+      </w:r>
+    </w:p>
+    <w:p>
+      <w:r>
+        <w:pict>
+          <v:rect style="width:0;height:1.5pt" o:hralign="center" o:hrstd="t" o:hr="t"/>
+        </w:pict>
+      </w:r>
+    </w:p>
+    <w:bookmarkEnd w:id="49"/>
+    <w:bookmarkStart w:id="50" w:name="якщо-сторінка-показала-помилку"/>
+    <w:p>
+      <w:pPr>
+        <w:pStyle w:val="Heading2"/>
+      </w:pPr>
+      <w:r>
+        <w:t xml:space="preserve">14. Якщо сторінка показала помилку</w:t>
+      </w:r>
+    </w:p>
+    <w:p>
+      <w:pPr>
+        <w:pStyle w:val="FirstParagraph"/>
+      </w:pPr>
+      <w:r>
+        <w:t xml:space="preserve">Якщо замість сторінки з’явилося повідомлення</w:t>
       </w:r>
       <w:r>
         <w:t xml:space="preserve"> </w:t>
@@ -3905,7 +4638,7 @@
       <w:pPr>
         <w:numPr>
           <w:ilvl w:val="0"/>
-          <w:numId w:val="1021"/>
+          <w:numId w:val="1015"/>
         </w:numPr>
         <w:pStyle w:val="Compact"/>
       </w:pPr>
@@ -3927,7 +4660,7 @@
       <w:pPr>
         <w:numPr>
           <w:ilvl w:val="0"/>
-          <w:numId w:val="1021"/>
+          <w:numId w:val="1015"/>
         </w:numPr>
         <w:pStyle w:val="Compact"/>
       </w:pPr>
@@ -3939,7 +4672,7 @@
       <w:pPr>
         <w:numPr>
           <w:ilvl w:val="0"/>
-          <w:numId w:val="1021"/>
+          <w:numId w:val="1015"/>
         </w:numPr>
         <w:pStyle w:val="Compact"/>
       </w:pPr>
@@ -3955,8 +4688,8 @@
         <w:t xml:space="preserve">Повідомлення на кшталт «Доступ обмежено», «Сторінку не знайдено», «Недостатньо прав» чи червоні підказки у формах — це не збої, а нормальні відповіді системи (немає доступу, невірні дані тощо); для них код не потрібен.</w:t>
       </w:r>
     </w:p>
-    <w:bookmarkEnd w:id="47"/>
-    <w:bookmarkEnd w:id="48"/>
+    <w:bookmarkEnd w:id="50"/>
+    <w:bookmarkEnd w:id="51"/>
     <w:sectPr/>
   </w:body>
 </w:document>
@@ -4264,6 +4997,12 @@
     <w:abstractNumId w:val="991"/>
   </w:num>
   <w:num w:numId="1004">
+    <w:abstractNumId w:val="991"/>
+  </w:num>
+  <w:num w:numId="1005">
+    <w:abstractNumId w:val="991"/>
+  </w:num>
+  <w:num w:numId="1006">
     <w:abstractNumId w:val="99411"/>
     <w:lvlOverride w:ilvl="0">
       <w:startOverride w:val="1"/>
@@ -4293,12 +5032,6 @@
       <w:startOverride w:val="1"/>
     </w:lvlOverride>
   </w:num>
-  <w:num w:numId="1005">
-    <w:abstractNumId w:val="991"/>
-  </w:num>
-  <w:num w:numId="1006">
-    <w:abstractNumId w:val="991"/>
-  </w:num>
   <w:num w:numId="1007">
     <w:abstractNumId w:val="991"/>
   </w:num>
@@ -4306,7 +5039,34 @@
     <w:abstractNumId w:val="991"/>
   </w:num>
   <w:num w:numId="1009">
-    <w:abstractNumId w:val="991"/>
+    <w:abstractNumId w:val="99411"/>
+    <w:lvlOverride w:ilvl="0">
+      <w:startOverride w:val="1"/>
+    </w:lvlOverride>
+    <w:lvlOverride w:ilvl="1">
+      <w:startOverride w:val="1"/>
+    </w:lvlOverride>
+    <w:lvlOverride w:ilvl="2">
+      <w:startOverride w:val="1"/>
+    </w:lvlOverride>
+    <w:lvlOverride w:ilvl="3">
+      <w:startOverride w:val="1"/>
+    </w:lvlOverride>
+    <w:lvlOverride w:ilvl="4">
+      <w:startOverride w:val="1"/>
+    </w:lvlOverride>
+    <w:lvlOverride w:ilvl="5">
+      <w:startOverride w:val="1"/>
+    </w:lvlOverride>
+    <w:lvlOverride w:ilvl="6">
+      <w:startOverride w:val="1"/>
+    </w:lvlOverride>
+    <w:lvlOverride w:ilvl="7">
+      <w:startOverride w:val="1"/>
+    </w:lvlOverride>
+    <w:lvlOverride w:ilvl="8">
+      <w:startOverride w:val="1"/>
+    </w:lvlOverride>
   </w:num>
   <w:num w:numId="1010">
     <w:abstractNumId w:val="99411"/>
@@ -4345,84 +5105,12 @@
     <w:abstractNumId w:val="991"/>
   </w:num>
   <w:num w:numId="1013">
-    <w:abstractNumId w:val="99411"/>
-    <w:lvlOverride w:ilvl="0">
-      <w:startOverride w:val="1"/>
-    </w:lvlOverride>
-    <w:lvlOverride w:ilvl="1">
-      <w:startOverride w:val="1"/>
-    </w:lvlOverride>
-    <w:lvlOverride w:ilvl="2">
-      <w:startOverride w:val="1"/>
-    </w:lvlOverride>
-    <w:lvlOverride w:ilvl="3">
-      <w:startOverride w:val="1"/>
-    </w:lvlOverride>
-    <w:lvlOverride w:ilvl="4">
-      <w:startOverride w:val="1"/>
-    </w:lvlOverride>
-    <w:lvlOverride w:ilvl="5">
-      <w:startOverride w:val="1"/>
-    </w:lvlOverride>
-    <w:lvlOverride w:ilvl="6">
-      <w:startOverride w:val="1"/>
-    </w:lvlOverride>
-    <w:lvlOverride w:ilvl="7">
-      <w:startOverride w:val="1"/>
-    </w:lvlOverride>
-    <w:lvlOverride w:ilvl="8">
-      <w:startOverride w:val="1"/>
-    </w:lvlOverride>
+    <w:abstractNumId w:val="991"/>
   </w:num>
   <w:num w:numId="1014">
     <w:abstractNumId w:val="991"/>
   </w:num>
   <w:num w:numId="1015">
-    <w:abstractNumId w:val="991"/>
-  </w:num>
-  <w:num w:numId="1016">
-    <w:abstractNumId w:val="991"/>
-  </w:num>
-  <w:num w:numId="1017">
-    <w:abstractNumId w:val="991"/>
-  </w:num>
-  <w:num w:numId="1018">
-    <w:abstractNumId w:val="99411"/>
-    <w:lvlOverride w:ilvl="0">
-      <w:startOverride w:val="1"/>
-    </w:lvlOverride>
-    <w:lvlOverride w:ilvl="1">
-      <w:startOverride w:val="1"/>
-    </w:lvlOverride>
-    <w:lvlOverride w:ilvl="2">
-      <w:startOverride w:val="1"/>
-    </w:lvlOverride>
-    <w:lvlOverride w:ilvl="3">
-      <w:startOverride w:val="1"/>
-    </w:lvlOverride>
-    <w:lvlOverride w:ilvl="4">
-      <w:startOverride w:val="1"/>
-    </w:lvlOverride>
-    <w:lvlOverride w:ilvl="5">
-      <w:startOverride w:val="1"/>
-    </w:lvlOverride>
-    <w:lvlOverride w:ilvl="6">
-      <w:startOverride w:val="1"/>
-    </w:lvlOverride>
-    <w:lvlOverride w:ilvl="7">
-      <w:startOverride w:val="1"/>
-    </w:lvlOverride>
-    <w:lvlOverride w:ilvl="8">
-      <w:startOverride w:val="1"/>
-    </w:lvlOverride>
-  </w:num>
-  <w:num w:numId="1019">
-    <w:abstractNumId w:val="991"/>
-  </w:num>
-  <w:num w:numId="1020">
-    <w:abstractNumId w:val="991"/>
-  </w:num>
-  <w:num w:numId="1021">
     <w:abstractNumId w:val="99411"/>
     <w:lvlOverride w:ilvl="0">
       <w:startOverride w:val="1"/>
@@ -4463,7 +5151,7 @@
         <w:rFonts w:asciiTheme="minorHAnsi" w:cstheme="minorBidi" w:eastAsiaTheme="minorHAnsi" w:hAnsiTheme="minorHAnsi"/>
         <w:sz w:val="24"/>
         <w:szCs w:val="24"/>
-        <w:lang w:bidi="ar-SA" w:eastAsia="en-US" w:val="uk"/>
+        <w:lang w:bidi="ar-SA" w:eastAsia="en-US" w:val="en-US"/>
       </w:rPr>
     </w:rPrDefault>
     <w:pPrDefault>

</xml_diff>